<commit_message>
Se agrega ejercicio 5 resuelto
</commit_message>
<xml_diff>
--- a/TPE_consigna.docx
+++ b/TPE_consigna.docx
@@ -764,7 +764,6 @@
       </w:pPr>
       <w:r/>
       <w:r/>
-      <w:r/>
     </w:p>
     <w:p>
       <w:pPr>
@@ -807,7 +806,6 @@
         <w:jc w:val="both"/>
         <w:rPr/>
       </w:pPr>
-      <w:r/>
       <w:r/>
       <w:r/>
     </w:p>
@@ -2501,13 +2499,617 @@
         <w:pStyle w:val="920"/>
         <w:spacing w:after="0" w:before="0"/>
         <w:ind w:firstLine="0" w:left="708"/>
-        <w:rPr/>
+        <w:rPr>
+          <w:highlight w:val="none"/>
+        </w:rPr>
       </w:pPr>
       <w:r>
         <w:tab/>
         <w:t xml:space="preserve">Indique para ambos casos, ¿qué dirección IP y qué puertos se deben utilizar? </w:t>
       </w:r>
       <w:r/>
+    </w:p>
+    <w:p>
+      <w:pPr>
+        <w:pStyle w:val="920"/>
+        <w:spacing w:after="0" w:before="0"/>
+        <w:ind w:firstLine="0" w:left="708"/>
+        <w:rPr>
+          <w:highlight w:val="none"/>
+        </w:rPr>
+      </w:pPr>
+      <w:r>
+        <w:rPr>
+          <w:highlight w:val="none"/>
+        </w:rPr>
+      </w:r>
+      <w:r/>
+      <w:r>
+        <w:rPr>
+          <w:highlight w:val="none"/>
+        </w:rPr>
+      </w:r>
+      <w:r>
+        <w:rPr>
+          <w:highlight w:val="none"/>
+        </w:rPr>
+      </w:r>
+      <w:r/>
+    </w:p>
+    <w:p>
+      <w:pPr>
+        <w:pStyle w:val="920"/>
+        <w:spacing w:after="0" w:before="0"/>
+        <w:ind w:firstLine="0" w:left="708"/>
+        <w:rPr>
+          <w:highlight w:val="none"/>
+          <w:lang w:val="en-US"/>
+        </w:rPr>
+      </w:pPr>
+      <w:r>
+        <w:rPr>
+          <w:highlight w:val="none"/>
+          <w:lang w:val="en-US"/>
+        </w:rPr>
+        <w:t xml:space="preserve">Desde PC1:</w:t>
+      </w:r>
+      <w:r>
+        <w:rPr>
+          <w:highlight w:val="none"/>
+          <w:lang w:val="en-US"/>
+        </w:rPr>
+      </w:r>
+    </w:p>
+    <w:p>
+      <w:pPr>
+        <w:pStyle w:val="920"/>
+        <w:spacing w:after="0" w:before="0"/>
+        <w:ind w:firstLine="0" w:left="708"/>
+        <w:rPr>
+          <w:highlight w:val="none"/>
+          <w:lang w:val="en-US"/>
+        </w:rPr>
+      </w:pPr>
+      <w:r>
+        <w:rPr>
+          <w:highlight w:val="none"/>
+          <w:lang w:val="en-US"/>
+        </w:rPr>
+      </w:r>
+      <w:r>
+        <w:rPr>
+          <w:highlight w:val="none"/>
+          <w:lang w:val="en-US"/>
+        </w:rPr>
+      </w:r>
+      <w:r>
+        <w:rPr>
+          <w:highlight w:val="none"/>
+          <w:lang w:val="en-US"/>
+        </w:rPr>
+      </w:r>
+    </w:p>
+    <w:p>
+      <w:pPr>
+        <w:pStyle w:val="920"/>
+        <w:spacing w:after="0" w:before="0"/>
+        <w:ind w:firstLine="0" w:left="708"/>
+        <w:rPr>
+          <w:highlight w:val="none"/>
+          <w:lang w:val="en-US"/>
+        </w:rPr>
+      </w:pPr>
+      <w:r>
+        <w:rPr>
+          <w:highlight w:val="none"/>
+          <w:lang w:val="en-US"/>
+        </w:rPr>
+        <w:t xml:space="preserve">Se debe usar la IP 10.2.0.11 y el puerto 8080, ya que PC1 est</w:t>
+      </w:r>
+      <w:r>
+        <w:rPr>
+          <w:highlight w:val="none"/>
+          <w:lang w:val="en-US"/>
+        </w:rPr>
+        <w:t xml:space="preserve">á dentro de la red del parque industrial, llega directamente a  Server1, sin necesidad de traducciones, y por eso se usa el n</w:t>
+      </w:r>
+      <w:r>
+        <w:rPr>
+          <w:highlight w:val="none"/>
+          <w:lang w:val="en-US"/>
+        </w:rPr>
+        <w:t xml:space="preserve">úmero de puerto real</w:t>
+      </w:r>
+      <w:r>
+        <w:rPr>
+          <w:highlight w:val="none"/>
+          <w:lang w:val="en-US"/>
+        </w:rPr>
+      </w:r>
+      <w:r>
+        <w:rPr>
+          <w:highlight w:val="none"/>
+          <w:lang w:val="en-US"/>
+        </w:rPr>
+      </w:r>
+    </w:p>
+    <w:p>
+      <w:pPr>
+        <w:pStyle w:val="920"/>
+        <w:spacing w:after="0" w:before="0"/>
+        <w:ind w:firstLine="0" w:left="708"/>
+        <w:rPr>
+          <w:highlight w:val="none"/>
+          <w:lang w:val="en-US"/>
+        </w:rPr>
+      </w:pPr>
+      <w:r>
+        <w:rPr>
+          <w:highlight w:val="none"/>
+          <w:lang w:val="en-US" w:bidi="en-US"/>
+        </w:rPr>
+      </w:r>
+      <w:r>
+        <w:rPr>
+          <w:highlight w:val="none"/>
+          <w:lang w:val="en-US" w:bidi="en-US"/>
+        </w:rPr>
+      </w:r>
+      <w:r>
+        <w:rPr>
+          <w:highlight w:val="none"/>
+          <w:lang w:val="en-US"/>
+        </w:rPr>
+      </w:r>
+    </w:p>
+    <w:p>
+      <w:pPr>
+        <w:pStyle w:val="920"/>
+        <w:spacing w:after="0" w:before="0"/>
+        <w:ind w:firstLine="0" w:left="708"/>
+        <w:rPr>
+          <w:highlight w:val="none"/>
+          <w:lang w:val="en-US"/>
+        </w:rPr>
+      </w:pPr>
+      <w:r>
+        <w:rPr>
+          <w:highlight w:val="none"/>
+          <w:lang w:val="en-US"/>
+        </w:rPr>
+      </w:r>
+      <w:r>
+        <mc:AlternateContent>
+          <mc:Choice Requires="wpg">
+            <w:drawing>
+              <wp:inline xmlns:wp="http://schemas.openxmlformats.org/drawingml/2006/wordprocessingDrawing" distT="0" distB="0" distL="0" distR="0">
+                <wp:extent cx="3659594" cy="1689043"/>
+                <wp:effectExtent l="0" t="0" r="0" b="0"/>
+                <wp:docPr id="2" name=""/>
+                <wp:cNvGraphicFramePr>
+                  <a:graphicFrameLocks xmlns:a="http://schemas.openxmlformats.org/drawingml/2006/main" noChangeAspect="1"/>
+                </wp:cNvGraphicFramePr>
+                <a:graphic xmlns:a="http://schemas.openxmlformats.org/drawingml/2006/main">
+                  <a:graphicData uri="http://schemas.openxmlformats.org/drawingml/2006/picture">
+                    <pic:pic xmlns:pic="http://schemas.openxmlformats.org/drawingml/2006/picture">
+                      <pic:nvPicPr>
+                        <pic:cNvPr id="1374609665" name=""/>
+                        <pic:cNvPicPr>
+                          <a:picLocks noChangeAspect="1"/>
+                        </pic:cNvPicPr>
+                        <pic:nvPr/>
+                      </pic:nvPicPr>
+                      <pic:blipFill rotWithShape="1">
+                        <a:blip r:embed="rId11"/>
+                        <a:stretch/>
+                      </pic:blipFill>
+                      <pic:spPr bwMode="auto">
+                        <a:xfrm flipH="0" flipV="0">
+                          <a:off x="0" y="0"/>
+                          <a:ext cx="3659594" cy="1689043"/>
+                        </a:xfrm>
+                        <a:prstGeom prst="rect">
+                          <a:avLst/>
+                        </a:prstGeom>
+                      </pic:spPr>
+                    </pic:pic>
+                  </a:graphicData>
+                </a:graphic>
+              </wp:inline>
+            </w:drawing>
+          </mc:Choice>
+          <mc:Fallback>
+            <w:pict>
+              <v:shapetype id="_x0000_t75" coordsize="21600,21600" o:spt="75" o:preferrelative="t" path="m@4@5l@4@11@9@11@9@5xe" filled="f" stroked="f">
+                <v:stroke joinstyle="miter"/>
+                <v:formulas>
+                  <v:f eqn="if lineDrawn pixelLineWidth 0"/>
+                  <v:f eqn="sum @0 1 0"/>
+                  <v:f eqn="sum 0 0 @1"/>
+                  <v:f eqn="prod @2 1 2"/>
+                  <v:f eqn="prod @3 21600 pixelWidth"/>
+                  <v:f eqn="prod @3 21600 pixelHeight"/>
+                  <v:f eqn="sum @0 0 1"/>
+                  <v:f eqn="prod @6 1 2"/>
+                  <v:f eqn="prod @7 21600 pixelWidth"/>
+                  <v:f eqn="sum @8 21600 0"/>
+                  <v:f eqn="prod @7 21600 pixelHeight"/>
+                  <v:f eqn="sum @10 21600 0"/>
+                </v:formulas>
+                <v:path o:extrusionok="f" gradientshapeok="t" o:connecttype="rect"/>
+                <o:lock v:ext="edit" aspectratio="t"/>
+              </v:shapetype>
+              <v:shape id="_x0000_i1" o:spid="_x0000_s1" type="#_x0000_t75" style="width:288.16pt;height:133.00pt;mso-wrap-distance-left:0.00pt;mso-wrap-distance-top:0.00pt;mso-wrap-distance-right:0.00pt;mso-wrap-distance-bottom:0.00pt;z-index:1;" stroked="false">
+                <v:imagedata r:id="rId11" o:title=""/>
+                <o:lock v:ext="edit" rotation="t"/>
+              </v:shape>
+            </w:pict>
+          </mc:Fallback>
+        </mc:AlternateContent>
+      </w:r>
+      <w:r>
+        <w:rPr>
+          <w:highlight w:val="none"/>
+          <w:lang w:val="en-US"/>
+        </w:rPr>
+      </w:r>
+      <w:r>
+        <w:rPr>
+          <w:highlight w:val="none"/>
+          <w:lang w:val="en-US"/>
+        </w:rPr>
+      </w:r>
+      <w:r/>
+    </w:p>
+    <w:p>
+      <w:pPr>
+        <w:pStyle w:val="920"/>
+        <w:spacing w:after="0" w:before="0"/>
+        <w:ind w:firstLine="0" w:left="708"/>
+        <w:rPr/>
+      </w:pPr>
+      <w:r/>
+      <w:r/>
+      <w:r/>
+    </w:p>
+    <w:p>
+      <w:pPr>
+        <w:pStyle w:val="920"/>
+        <w:spacing w:after="0" w:before="0"/>
+        <w:ind w:firstLine="0" w:left="708"/>
+        <w:rPr>
+          <w:highlight w:val="none"/>
+          <w:lang w:val="en-US"/>
+        </w:rPr>
+      </w:pPr>
+      <w:r>
+        <w:rPr>
+          <w:highlight w:val="none"/>
+          <w:lang w:val="en-US"/>
+        </w:rPr>
+        <w:t xml:space="preserve">Desde CasaJefe:</w:t>
+      </w:r>
+      <w:r>
+        <w:rPr>
+          <w:highlight w:val="none"/>
+          <w:lang w:val="en-US"/>
+        </w:rPr>
+      </w:r>
+    </w:p>
+    <w:p>
+      <w:pPr>
+        <w:pStyle w:val="920"/>
+        <w:spacing w:after="0" w:before="0"/>
+        <w:ind w:firstLine="0" w:left="708"/>
+        <w:rPr>
+          <w:highlight w:val="none"/>
+          <w:lang w:val="en-US"/>
+        </w:rPr>
+      </w:pPr>
+      <w:r>
+        <w:rPr>
+          <w:highlight w:val="none"/>
+          <w:lang w:val="en-US"/>
+        </w:rPr>
+      </w:r>
+      <w:r>
+        <w:rPr>
+          <w:highlight w:val="none"/>
+          <w:lang w:val="en-US"/>
+        </w:rPr>
+      </w:r>
+      <w:r>
+        <w:rPr>
+          <w:highlight w:val="none"/>
+          <w:lang w:val="en-US"/>
+        </w:rPr>
+      </w:r>
+    </w:p>
+    <w:p>
+      <w:pPr>
+        <w:pStyle w:val="920"/>
+        <w:spacing w:after="0" w:before="0"/>
+        <w:ind w:firstLine="0" w:left="708"/>
+        <w:rPr>
+          <w:highlight w:val="none"/>
+        </w:rPr>
+      </w:pPr>
+      <w:r>
+        <w:rPr>
+          <w:highlight w:val="none"/>
+          <w:lang w:val="en-US"/>
+        </w:rPr>
+        <w:t xml:space="preserve">Se debe usar la IP </w:t>
+      </w:r>
+      <w:r>
+        <w:t xml:space="preserve">201.0.2.2</w:t>
+      </w:r>
+      <w:r>
+        <w:rPr>
+          <w:highlight w:val="none"/>
+          <w:lang w:val="en-US"/>
+        </w:rPr>
+        <w:t xml:space="preserve"> y el puerto 80, </w:t>
+      </w:r>
+      <w:r>
+        <w:rPr>
+          <w:highlight w:val="none"/>
+          <w:lang w:val="en-US"/>
+        </w:rPr>
+        <w:t xml:space="preserve">ya que el R2 act</w:t>
+      </w:r>
+      <w:r>
+        <w:rPr>
+          <w:highlight w:val="none"/>
+          <w:lang w:val="en-US"/>
+        </w:rPr>
+        <w:t xml:space="preserve">úa como intermediario para cualquier paquete que llegue de una red externa, y luego aplica la regla</w:t>
+      </w:r>
+      <w:r>
+        <w:rPr>
+          <w:lang w:val="en-US"/>
+        </w:rPr>
+        <w:t xml:space="preserve">:</w:t>
+        <w:br/>
+        <w:t xml:space="preserve">i</w:t>
+      </w:r>
+      <w:r>
+        <w:t xml:space="preserve">ptables -t nat -A PREROUTING -i eth0 -p tcp --dport 80 -j DNAT --to-destination 10.2.0.11:8080</w:t>
+      </w:r>
+      <w:r>
+        <w:rPr>
+          <w:highlight w:val="none"/>
+          <w:lang w:val="en-US"/>
+        </w:rPr>
+      </w:r>
+    </w:p>
+    <w:p>
+      <w:pPr>
+        <w:pStyle w:val="920"/>
+        <w:spacing w:after="0" w:before="0"/>
+        <w:ind w:firstLine="0" w:left="708"/>
+        <w:rPr>
+          <w:highlight w:val="none"/>
+          <w:lang w:val="en-US"/>
+        </w:rPr>
+      </w:pPr>
+      <w:r>
+        <w:rPr>
+          <w:highlight w:val="none"/>
+          <w:lang w:val="en-US" w:bidi="en-US"/>
+        </w:rPr>
+        <w:t xml:space="preserve">Para redirigir el mensaje hacia el puerto 8080 en el Server1</w:t>
+      </w:r>
+      <w:r>
+        <w:rPr>
+          <w:highlight w:val="none"/>
+          <w:lang w:val="en-US" w:bidi="en-US"/>
+        </w:rPr>
+      </w:r>
+      <w:r>
+        <w:rPr>
+          <w:highlight w:val="none"/>
+          <w:lang w:val="en-US"/>
+        </w:rPr>
+      </w:r>
+    </w:p>
+    <w:p>
+      <w:pPr>
+        <w:pStyle w:val="920"/>
+        <w:spacing w:after="0" w:before="0"/>
+        <w:ind w:firstLine="0" w:left="708"/>
+        <w:rPr>
+          <w:highlight w:val="none"/>
+          <w:lang w:val="en-US"/>
+        </w:rPr>
+      </w:pPr>
+      <w:r>
+        <w:rPr>
+          <w:highlight w:val="none"/>
+          <w:lang w:val="en-US" w:bidi="en-US"/>
+        </w:rPr>
+      </w:r>
+      <w:r>
+        <w:rPr>
+          <w:highlight w:val="none"/>
+          <w:lang w:val="en-US" w:bidi="en-US"/>
+        </w:rPr>
+      </w:r>
+      <w:r>
+        <w:rPr>
+          <w:highlight w:val="none"/>
+          <w:lang w:val="en-US"/>
+        </w:rPr>
+      </w:r>
+    </w:p>
+    <w:p>
+      <w:pPr>
+        <w:pStyle w:val="920"/>
+        <w:spacing w:after="0" w:before="0"/>
+        <w:ind w:firstLine="0" w:left="708"/>
+        <w:rPr>
+          <w:highlight w:val="none"/>
+          <w:lang w:val="en-US" w:bidi="en-US"/>
+        </w:rPr>
+      </w:pPr>
+      <w:r>
+        <w:rPr>
+          <w:highlight w:val="none"/>
+          <w:lang w:val="en-US" w:bidi="en-US"/>
+        </w:rPr>
+      </w:r>
+      <w:r>
+        <mc:AlternateContent>
+          <mc:Choice Requires="wpg">
+            <w:drawing>
+              <wp:inline xmlns:wp="http://schemas.openxmlformats.org/drawingml/2006/wordprocessingDrawing" distT="0" distB="0" distL="0" distR="0">
+                <wp:extent cx="3659594" cy="1709355"/>
+                <wp:effectExtent l="0" t="0" r="0" b="0"/>
+                <wp:docPr id="3" name=""/>
+                <wp:cNvGraphicFramePr>
+                  <a:graphicFrameLocks xmlns:a="http://schemas.openxmlformats.org/drawingml/2006/main" noChangeAspect="1"/>
+                </wp:cNvGraphicFramePr>
+                <a:graphic xmlns:a="http://schemas.openxmlformats.org/drawingml/2006/main">
+                  <a:graphicData uri="http://schemas.openxmlformats.org/drawingml/2006/picture">
+                    <pic:pic xmlns:pic="http://schemas.openxmlformats.org/drawingml/2006/picture">
+                      <pic:nvPicPr>
+                        <pic:cNvPr id="525121695" name=""/>
+                        <pic:cNvPicPr>
+                          <a:picLocks noChangeAspect="1"/>
+                        </pic:cNvPicPr>
+                        <pic:nvPr/>
+                      </pic:nvPicPr>
+                      <pic:blipFill rotWithShape="1">
+                        <a:blip r:embed="rId12"/>
+                        <a:stretch/>
+                      </pic:blipFill>
+                      <pic:spPr bwMode="auto">
+                        <a:xfrm flipH="0" flipV="0">
+                          <a:off x="0" y="0"/>
+                          <a:ext cx="3659594" cy="1709354"/>
+                        </a:xfrm>
+                        <a:prstGeom prst="rect">
+                          <a:avLst/>
+                        </a:prstGeom>
+                      </pic:spPr>
+                    </pic:pic>
+                  </a:graphicData>
+                </a:graphic>
+              </wp:inline>
+            </w:drawing>
+          </mc:Choice>
+          <mc:Fallback>
+            <w:pict>
+              <v:shapetype id="_x0000_t75" coordsize="21600,21600" o:spt="75" o:preferrelative="t" path="m@4@5l@4@11@9@11@9@5xe" filled="f" stroked="f">
+                <v:stroke joinstyle="miter"/>
+                <v:formulas>
+                  <v:f eqn="if lineDrawn pixelLineWidth 0"/>
+                  <v:f eqn="sum @0 1 0"/>
+                  <v:f eqn="sum 0 0 @1"/>
+                  <v:f eqn="prod @2 1 2"/>
+                  <v:f eqn="prod @3 21600 pixelWidth"/>
+                  <v:f eqn="prod @3 21600 pixelHeight"/>
+                  <v:f eqn="sum @0 0 1"/>
+                  <v:f eqn="prod @6 1 2"/>
+                  <v:f eqn="prod @7 21600 pixelWidth"/>
+                  <v:f eqn="sum @8 21600 0"/>
+                  <v:f eqn="prod @7 21600 pixelHeight"/>
+                  <v:f eqn="sum @10 21600 0"/>
+                </v:formulas>
+                <v:path o:extrusionok="f" gradientshapeok="t" o:connecttype="rect"/>
+                <o:lock v:ext="edit" aspectratio="t"/>
+              </v:shapetype>
+              <v:shape id="_x0000_i2" o:spid="_x0000_s2" type="#_x0000_t75" style="width:288.16pt;height:134.59pt;mso-wrap-distance-left:0.00pt;mso-wrap-distance-top:0.00pt;mso-wrap-distance-right:0.00pt;mso-wrap-distance-bottom:0.00pt;z-index:1;" stroked="false">
+                <v:imagedata r:id="rId12" o:title=""/>
+                <o:lock v:ext="edit" rotation="t"/>
+              </v:shape>
+            </w:pict>
+          </mc:Fallback>
+        </mc:AlternateContent>
+      </w:r>
+      <w:r>
+        <w:rPr>
+          <w:highlight w:val="none"/>
+          <w:lang w:val="en-US" w:bidi="en-US"/>
+        </w:rPr>
+      </w:r>
+      <w:r/>
+      <w:r>
+        <w:rPr>
+          <w:highlight w:val="none"/>
+          <w:lang w:val="en-US" w:bidi="en-US"/>
+        </w:rPr>
+      </w:r>
+      <w:r>
+        <w:rPr>
+          <w:highlight w:val="none"/>
+          <w:lang w:val="en-US" w:bidi="en-US"/>
+        </w:rPr>
+      </w:r>
+      <w:r>
+        <w:rPr>
+          <w:highlight w:val="none"/>
+          <w:lang w:val="en-US"/>
+        </w:rPr>
+      </w:r>
+    </w:p>
+    <w:p>
+      <w:pPr>
+        <w:pStyle w:val="920"/>
+        <w:spacing w:after="0" w:before="0"/>
+        <w:ind w:firstLine="0" w:left="708"/>
+        <w:rPr>
+          <w:highlight w:val="none"/>
+          <w:lang w:val="en-US"/>
+        </w:rPr>
+      </w:pPr>
+      <w:r>
+        <w:rPr>
+          <w:highlight w:val="none"/>
+          <w:lang w:val="en-US"/>
+        </w:rPr>
+      </w:r>
+      <w:r>
+        <w:rPr>
+          <w:highlight w:val="none"/>
+          <w:lang w:val="en-US"/>
+        </w:rPr>
+      </w:r>
+      <w:r>
+        <w:rPr>
+          <w:highlight w:val="none"/>
+          <w:lang w:val="en-US"/>
+        </w:rPr>
+      </w:r>
+    </w:p>
+    <w:p>
+      <w:pPr>
+        <w:pStyle w:val="920"/>
+        <w:spacing w:after="0" w:before="0"/>
+        <w:ind w:firstLine="0" w:left="708"/>
+        <w:rPr>
+          <w:highlight w:val="none"/>
+          <w:lang w:val="en-US"/>
+        </w:rPr>
+      </w:pPr>
+      <w:r>
+        <w:rPr>
+          <w:highlight w:val="none"/>
+          <w:lang w:val="en-US" w:bidi="en-US"/>
+        </w:rPr>
+      </w:r>
+      <w:r>
+        <w:rPr>
+          <w:highlight w:val="none"/>
+          <w:lang w:val="en-US" w:bidi="en-US"/>
+        </w:rPr>
+      </w:r>
+      <w:r>
+        <w:rPr>
+          <w:highlight w:val="none"/>
+          <w:lang w:val="en-US" w:bidi="en-US"/>
+        </w:rPr>
+      </w:r>
     </w:p>
     <w:p>
       <w:pPr>

</xml_diff>

<commit_message>
Se agregan punto 5 y 6, y descripciones faltantes de las reglas iptables
</commit_message>
<xml_diff>
--- a/TPE_consigna.docx
+++ b/TPE_consigna.docx
@@ -720,6 +720,7 @@
       </w:pPr>
       <w:r/>
       <w:r/>
+      <w:r/>
     </w:p>
     <w:p>
       <w:pPr>
@@ -729,6 +730,7 @@
         <w:jc w:val="both"/>
         <w:rPr/>
       </w:pPr>
+      <w:r/>
       <w:r/>
       <w:r/>
     </w:p>
@@ -796,16 +798,6 @@
         <w:rPr/>
       </w:pPr>
       <w:r/>
-      <w:r/>
-    </w:p>
-    <w:p>
-      <w:pPr>
-        <w:pStyle w:val="920"/>
-        <w:spacing/>
-        <w:ind/>
-        <w:jc w:val="both"/>
-        <w:rPr/>
-      </w:pPr>
       <w:r/>
       <w:r/>
     </w:p>
@@ -1004,6 +996,99 @@
             </w:r>
             <w:r/>
           </w:p>
+        </w:tc>
+        <w:tc>
+          <w:tcPr>
+            <w:shd w:val="clear" w:color="auto" w:fill="auto"/>
+            <w:tcBorders>
+              <w:top w:val="single" w:color="000000" w:sz="18" w:space="0"/>
+              <w:left w:val="single" w:color="000000" w:sz="8" w:space="0"/>
+              <w:bottom w:val="single" w:color="000000" w:sz="8" w:space="0"/>
+              <w:right w:val="single" w:color="000000" w:sz="8" w:space="0"/>
+            </w:tcBorders>
+            <w:tcW w:w="2644" w:type="dxa"/>
+          </w:tcPr>
+          <w:p>
+            <w:pPr>
+              <w:pStyle w:val="920"/>
+              <w:widowControl w:val="false"/>
+              <w:spacing w:after="0" w:before="0" w:line="240" w:lineRule="auto"/>
+              <w:ind/>
+              <w:jc w:val="left"/>
+              <w:rPr>
+                <w:rFonts w:ascii="Calibri" w:hAnsi="Calibri" w:cs="Calibri"/>
+                <w:sz w:val="22"/>
+                <w:szCs w:val="22"/>
+              </w:rPr>
+            </w:pPr>
+            <w:r>
+              <w:rPr>
+                <w:rFonts w:eastAsia="Calibri" w:cs="Calibri"/>
+                <w:sz w:val="22"/>
+                <w:szCs w:val="22"/>
+                <w:lang w:val="es-AR" w:eastAsia="zh-CN" w:bidi="hi-IN"/>
+              </w:rPr>
+            </w:r>
+            <w:r>
+              <w:rPr>
+                <w:rFonts w:ascii="Calibri" w:hAnsi="Calibri" w:eastAsia="Calibri" w:cs="Calibri"/>
+                <w:color w:val="000000"/>
+                <w:sz w:val="22"/>
+                <w:szCs w:val="22"/>
+              </w:rPr>
+              <w:t xml:space="preserve">Permite tráfico hacia Internet (por </w:t>
+            </w:r>
+            <w:r>
+              <w:rPr>
+                <w:rFonts w:ascii="Calibri" w:hAnsi="Calibri" w:eastAsia="Calibri" w:cs="Calibri"/>
+                <w:color w:val="000000"/>
+                <w:sz w:val="22"/>
+                <w:szCs w:val="22"/>
+              </w:rPr>
+              <w:t xml:space="preserve">eth0</w:t>
+            </w:r>
+            <w:r>
+              <w:rPr>
+                <w:rFonts w:ascii="Calibri" w:hAnsi="Calibri" w:eastAsia="Calibri" w:cs="Calibri"/>
+                <w:color w:val="000000"/>
+                <w:sz w:val="22"/>
+                <w:szCs w:val="22"/>
+              </w:rPr>
+              <w:t xml:space="preserve">) a los paquetes del Datacenter</w:t>
+            </w:r>
+            <w:r>
+              <w:rPr>
+                <w:rFonts w:ascii="Calibri" w:hAnsi="Calibri" w:eastAsia="Calibri" w:cs="Calibri"/>
+                <w:sz w:val="22"/>
+                <w:szCs w:val="22"/>
+                <w:lang w:val="es-AR" w:eastAsia="zh-CN" w:bidi="hi-IN"/>
+              </w:rPr>
+            </w:r>
+            <w:r>
+              <w:rPr>
+                <w:rFonts w:ascii="Calibri" w:hAnsi="Calibri" w:eastAsia="Calibri" w:cs="Calibri"/>
+                <w:sz w:val="22"/>
+                <w:szCs w:val="22"/>
+                <w:lang w:val="es-AR" w:eastAsia="zh-CN" w:bidi="hi-IN"/>
+              </w:rPr>
+            </w:r>
+          </w:p>
+        </w:tc>
+      </w:tr>
+      <w:tr>
+        <w:trPr/>
+        <w:tc>
+          <w:tcPr>
+            <w:shd w:val="clear" w:color="ffffff" w:fill="ffffff"/>
+            <w:tcBorders>
+              <w:top w:val="single" w:color="000000" w:sz="18" w:space="0"/>
+              <w:left w:val="single" w:color="000000" w:sz="8" w:space="0"/>
+              <w:bottom w:val="single" w:color="000000" w:sz="8" w:space="0"/>
+              <w:right w:val="single" w:color="000000" w:sz="8" w:space="0"/>
+            </w:tcBorders>
+            <w:tcW w:w="5860" w:type="dxa"/>
+            <w:vMerge w:val="restart"/>
+          </w:tcPr>
           <w:p>
             <w:pPr>
               <w:pStyle w:val="920"/>
@@ -1023,7 +1108,136 @@
               <w:t xml:space="preserve">iptables -t filter -A FORWARD -s 10.2.4.0/24 -o eth0 -j ACCEPT</w:t>
             </w:r>
             <w:r/>
+            <w:r/>
           </w:p>
+        </w:tc>
+        <w:tc>
+          <w:tcPr>
+            <w:shd w:val="clear" w:color="ffffff" w:fill="ffffff"/>
+            <w:tcBorders>
+              <w:top w:val="single" w:color="000000" w:sz="18" w:space="0"/>
+              <w:left w:val="single" w:color="000000" w:sz="8" w:space="0"/>
+              <w:bottom w:val="single" w:color="000000" w:sz="8" w:space="0"/>
+              <w:right w:val="single" w:color="000000" w:sz="8" w:space="0"/>
+            </w:tcBorders>
+            <w:tcW w:w="2644" w:type="dxa"/>
+            <w:vMerge w:val="restart"/>
+          </w:tcPr>
+          <w:p>
+            <w:pPr>
+              <w:pStyle w:val="920"/>
+              <w:widowControl w:val="false"/>
+              <w:spacing w:after="0" w:before="0" w:line="240" w:lineRule="auto"/>
+              <w:ind/>
+              <w:jc w:val="left"/>
+              <w:rPr>
+                <w:rFonts w:ascii="Calibri" w:hAnsi="Calibri" w:cs="Calibri"/>
+                <w:sz w:val="22"/>
+                <w:szCs w:val="22"/>
+              </w:rPr>
+            </w:pPr>
+            <w:r>
+              <w:rPr>
+                <w:rFonts w:eastAsia="Calibri" w:cs="Calibri"/>
+                <w:sz w:val="22"/>
+                <w:szCs w:val="22"/>
+                <w:lang w:val="es-AR" w:eastAsia="zh-CN" w:bidi="hi-IN"/>
+              </w:rPr>
+            </w:r>
+            <w:r>
+              <w:rPr>
+                <w:rFonts w:ascii="Calibri" w:hAnsi="Calibri" w:eastAsia="Calibri" w:cs="Calibri"/>
+                <w:color w:val="000000"/>
+                <w:sz w:val="22"/>
+                <w:szCs w:val="22"/>
+              </w:rPr>
+              <w:t xml:space="preserve">Permite tráfico hacia Internet (por </w:t>
+            </w:r>
+            <w:r>
+              <w:rPr>
+                <w:rFonts w:ascii="Calibri" w:hAnsi="Calibri" w:eastAsia="Calibri" w:cs="Calibri"/>
+                <w:color w:val="000000"/>
+                <w:sz w:val="22"/>
+                <w:szCs w:val="22"/>
+              </w:rPr>
+              <w:t xml:space="preserve">eth0</w:t>
+            </w:r>
+            <w:r>
+              <w:rPr>
+                <w:rFonts w:ascii="Calibri" w:hAnsi="Calibri" w:eastAsia="Calibri" w:cs="Calibri"/>
+                <w:color w:val="000000"/>
+                <w:sz w:val="22"/>
+                <w:szCs w:val="22"/>
+              </w:rPr>
+              <w:t xml:space="preserve">) a los paquetes </w:t>
+            </w:r>
+            <w:r>
+              <w:rPr>
+                <w:rFonts w:ascii="Calibri" w:hAnsi="Calibri" w:eastAsia="Calibri" w:cs="Calibri"/>
+                <w:color w:val="000000"/>
+                <w:sz w:val="22"/>
+                <w:szCs w:val="22"/>
+                <w:lang w:val="en-US"/>
+              </w:rPr>
+              <w:t xml:space="preserve">de la F</w:t>
+            </w:r>
+            <w:r>
+              <w:rPr>
+                <w:rFonts w:ascii="Calibri" w:hAnsi="Calibri" w:eastAsia="Calibri" w:cs="Calibri"/>
+                <w:color w:val="000000"/>
+                <w:sz w:val="22"/>
+                <w:szCs w:val="22"/>
+                <w:lang w:val="en-US"/>
+              </w:rPr>
+              <w:t xml:space="preserve">ábrica A</w:t>
+            </w:r>
+            <w:r>
+              <w:rPr>
+                <w:rFonts w:ascii="Calibri" w:hAnsi="Calibri" w:cs="Calibri"/>
+                <w:sz w:val="22"/>
+                <w:szCs w:val="22"/>
+              </w:rPr>
+            </w:r>
+            <w:r>
+              <w:rPr>
+                <w:rFonts w:eastAsia="Calibri" w:cs="Calibri"/>
+                <w:sz w:val="22"/>
+                <w:szCs w:val="22"/>
+                <w:lang w:val="es-AR" w:eastAsia="zh-CN" w:bidi="hi-IN"/>
+              </w:rPr>
+            </w:r>
+            <w:r>
+              <w:rPr>
+                <w:rFonts w:eastAsia="Calibri" w:cs="Calibri"/>
+                <w:sz w:val="22"/>
+                <w:szCs w:val="22"/>
+                <w:lang w:val="es-AR" w:eastAsia="zh-CN" w:bidi="hi-IN"/>
+              </w:rPr>
+            </w:r>
+            <w:r>
+              <w:rPr>
+                <w:rFonts w:ascii="Calibri" w:hAnsi="Calibri" w:cs="Calibri"/>
+                <w:sz w:val="22"/>
+                <w:szCs w:val="22"/>
+              </w:rPr>
+            </w:r>
+          </w:p>
+        </w:tc>
+      </w:tr>
+      <w:tr>
+        <w:trPr/>
+        <w:tc>
+          <w:tcPr>
+            <w:shd w:val="clear" w:color="ffffff" w:fill="ffffff"/>
+            <w:tcBorders>
+              <w:top w:val="single" w:color="000000" w:sz="18" w:space="0"/>
+              <w:left w:val="single" w:color="000000" w:sz="8" w:space="0"/>
+              <w:bottom w:val="single" w:color="000000" w:sz="8" w:space="0"/>
+              <w:right w:val="single" w:color="000000" w:sz="8" w:space="0"/>
+            </w:tcBorders>
+            <w:tcW w:w="5860" w:type="dxa"/>
+            <w:vMerge w:val="restart"/>
+          </w:tcPr>
           <w:p>
             <w:pPr>
               <w:pStyle w:val="920"/>
@@ -1043,7 +1257,163 @@
               <w:t xml:space="preserve">iptables -t filter -A FORWARD -s 10.2.5.0/24 -o eth0 -j ACCEPT</w:t>
             </w:r>
             <w:r/>
+            <w:r/>
+            <w:r>
+              <w:rPr>
+                <w:rFonts w:eastAsia="Calibri" w:cs="Calibri"/>
+                <w:sz w:val="22"/>
+                <w:szCs w:val="22"/>
+                <w:lang w:val="es-AR" w:eastAsia="zh-CN" w:bidi="hi-IN"/>
+              </w:rPr>
+            </w:r>
+            <w:r>
+              <w:rPr>
+                <w:rFonts w:ascii="Calibri" w:hAnsi="Calibri" w:eastAsia="Calibri" w:cs="Calibri"/>
+                <w:sz w:val="22"/>
+                <w:szCs w:val="22"/>
+                <w:lang w:val="es-AR" w:eastAsia="zh-CN" w:bidi="hi-IN"/>
+              </w:rPr>
+            </w:r>
+            <w:r/>
           </w:p>
+        </w:tc>
+        <w:tc>
+          <w:tcPr>
+            <w:shd w:val="clear" w:color="ffffff" w:fill="ffffff"/>
+            <w:tcBorders>
+              <w:top w:val="single" w:color="000000" w:sz="18" w:space="0"/>
+              <w:left w:val="single" w:color="000000" w:sz="8" w:space="0"/>
+              <w:bottom w:val="single" w:color="000000" w:sz="8" w:space="0"/>
+              <w:right w:val="single" w:color="000000" w:sz="8" w:space="0"/>
+            </w:tcBorders>
+            <w:tcW w:w="2644" w:type="dxa"/>
+            <w:vMerge w:val="restart"/>
+          </w:tcPr>
+          <w:p>
+            <w:pPr>
+              <w:pStyle w:val="920"/>
+              <w:widowControl w:val="false"/>
+              <w:spacing w:after="0" w:before="0" w:line="240" w:lineRule="auto"/>
+              <w:ind/>
+              <w:jc w:val="left"/>
+              <w:rPr>
+                <w:rFonts w:ascii="Calibri" w:hAnsi="Calibri" w:cs="Calibri"/>
+                <w:sz w:val="22"/>
+                <w:szCs w:val="22"/>
+              </w:rPr>
+            </w:pPr>
+            <w:r>
+              <w:rPr>
+                <w:rFonts w:eastAsia="Calibri" w:cs="Calibri"/>
+                <w:sz w:val="22"/>
+                <w:szCs w:val="22"/>
+                <w:lang w:val="es-AR" w:eastAsia="zh-CN" w:bidi="hi-IN"/>
+              </w:rPr>
+            </w:r>
+            <w:r>
+              <w:rPr>
+                <w:rFonts w:ascii="Calibri" w:hAnsi="Calibri" w:eastAsia="Calibri" w:cs="Calibri"/>
+                <w:color w:val="000000"/>
+                <w:sz w:val="22"/>
+                <w:szCs w:val="22"/>
+              </w:rPr>
+              <w:t xml:space="preserve">Permite tráfico hacia Internet (por</w:t>
+            </w:r>
+            <w:r>
+              <w:rPr>
+                <w:rFonts w:ascii="Calibri" w:hAnsi="Calibri" w:eastAsia="Calibri" w:cs="Calibri"/>
+                <w:color w:val="000000"/>
+                <w:sz w:val="22"/>
+                <w:szCs w:val="22"/>
+                <w:lang w:val="en-US"/>
+              </w:rPr>
+              <w:t xml:space="preserve"> </w:t>
+            </w:r>
+            <w:r>
+              <w:rPr>
+                <w:rFonts w:ascii="Calibri" w:hAnsi="Calibri" w:eastAsia="Calibri" w:cs="Calibri"/>
+                <w:color w:val="000000"/>
+                <w:sz w:val="22"/>
+                <w:szCs w:val="22"/>
+              </w:rPr>
+              <w:t xml:space="preserve">eth0</w:t>
+            </w:r>
+            <w:r>
+              <w:rPr>
+                <w:rFonts w:ascii="Calibri" w:hAnsi="Calibri" w:eastAsia="Calibri" w:cs="Calibri"/>
+                <w:color w:val="000000"/>
+                <w:sz w:val="22"/>
+                <w:szCs w:val="22"/>
+              </w:rPr>
+              <w:t xml:space="preserve">) a los paquetes </w:t>
+            </w:r>
+            <w:r>
+              <w:rPr>
+                <w:rFonts w:ascii="Calibri" w:hAnsi="Calibri" w:eastAsia="Calibri" w:cs="Calibri"/>
+                <w:color w:val="000000"/>
+                <w:sz w:val="22"/>
+                <w:szCs w:val="22"/>
+                <w:lang w:val="en-US"/>
+              </w:rPr>
+              <w:t xml:space="preserve">de la F</w:t>
+            </w:r>
+            <w:r>
+              <w:rPr>
+                <w:rFonts w:ascii="Calibri" w:hAnsi="Calibri" w:eastAsia="Calibri" w:cs="Calibri"/>
+                <w:color w:val="000000"/>
+                <w:sz w:val="22"/>
+                <w:szCs w:val="22"/>
+                <w:lang w:val="en-US"/>
+              </w:rPr>
+              <w:t xml:space="preserve">ábrica B</w:t>
+            </w:r>
+            <w:r>
+              <w:rPr>
+                <w:rFonts w:ascii="Calibri" w:hAnsi="Calibri" w:cs="Calibri"/>
+                <w:sz w:val="22"/>
+                <w:szCs w:val="22"/>
+              </w:rPr>
+            </w:r>
+            <w:r>
+              <w:rPr>
+                <w:rFonts w:eastAsia="Calibri" w:cs="Calibri"/>
+                <w:sz w:val="22"/>
+                <w:szCs w:val="22"/>
+                <w:lang w:val="es-AR" w:eastAsia="zh-CN" w:bidi="hi-IN"/>
+              </w:rPr>
+            </w:r>
+            <w:r>
+              <w:rPr>
+                <w:rFonts w:eastAsia="Calibri" w:cs="Calibri"/>
+                <w:sz w:val="22"/>
+                <w:szCs w:val="22"/>
+                <w:lang w:val="es-AR" w:eastAsia="zh-CN" w:bidi="hi-IN"/>
+              </w:rPr>
+            </w:r>
+            <w:r>
+              <w:rPr>
+                <w:rFonts w:ascii="Calibri" w:hAnsi="Calibri" w:cs="Calibri"/>
+                <w:sz w:val="22"/>
+                <w:szCs w:val="22"/>
+              </w:rPr>
+            </w:r>
+          </w:p>
+        </w:tc>
+      </w:tr>
+      <w:tr>
+        <w:trPr/>
+        <w:tc>
+          <w:tcPr>
+            <w:shd w:val="clear" w:color="ffffff" w:fill="ffffff"/>
+            <w:tcBorders>
+              <w:top w:val="single" w:color="000000" w:sz="18" w:space="0"/>
+              <w:left w:val="single" w:color="000000" w:sz="8" w:space="0"/>
+              <w:bottom w:val="single" w:color="000000" w:sz="8" w:space="0"/>
+              <w:right w:val="single" w:color="000000" w:sz="8" w:space="0"/>
+            </w:tcBorders>
+            <w:tcW w:w="5860" w:type="dxa"/>
+            <w:vMerge w:val="restart"/>
+          </w:tcPr>
           <w:p>
             <w:pPr>
               <w:pStyle w:val="920"/>
@@ -1083,33 +1453,14 @@
                 <w:lang w:val="es-AR" w:eastAsia="zh-CN" w:bidi="hi-IN"/>
               </w:rPr>
             </w:r>
-          </w:p>
-        </w:tc>
-        <w:tc>
-          <w:tcPr>
-            <w:shd w:val="clear" w:color="auto" w:fill="auto"/>
-            <w:tcBorders>
-              <w:top w:val="single" w:color="000000" w:sz="18" w:space="0"/>
-              <w:left w:val="single" w:color="000000" w:sz="8" w:space="0"/>
-              <w:bottom w:val="single" w:color="000000" w:sz="8" w:space="0"/>
-              <w:right w:val="single" w:color="000000" w:sz="8" w:space="0"/>
-            </w:tcBorders>
-            <w:tcW w:w="2644" w:type="dxa"/>
-          </w:tcPr>
-          <w:p>
-            <w:pPr>
-              <w:pStyle w:val="920"/>
-              <w:widowControl w:val="false"/>
-              <w:spacing w:after="0" w:before="0" w:line="240" w:lineRule="auto"/>
-              <w:ind/>
-              <w:jc w:val="left"/>
+            <w:r>
               <w:rPr>
-                <w:rFonts w:ascii="Calibri" w:hAnsi="Calibri" w:eastAsia="Calibri" w:cs="Calibri"/>
+                <w:rFonts w:eastAsia="Calibri" w:cs="Calibri"/>
                 <w:sz w:val="22"/>
                 <w:szCs w:val="22"/>
                 <w:lang w:val="es-AR" w:eastAsia="zh-CN" w:bidi="hi-IN"/>
               </w:rPr>
-            </w:pPr>
+            </w:r>
             <w:r>
               <w:rPr>
                 <w:rFonts w:eastAsia="Calibri" w:cs="Calibri"/>
@@ -1126,9 +1477,55 @@
                 <w:lang w:val="es-AR" w:eastAsia="zh-CN" w:bidi="hi-IN"/>
               </w:rPr>
             </w:r>
+          </w:p>
+        </w:tc>
+        <w:tc>
+          <w:tcPr>
+            <w:shd w:val="clear" w:color="ffffff" w:fill="ffffff"/>
+            <w:tcBorders>
+              <w:top w:val="single" w:color="000000" w:sz="18" w:space="0"/>
+              <w:left w:val="single" w:color="000000" w:sz="8" w:space="0"/>
+              <w:bottom w:val="single" w:color="000000" w:sz="8" w:space="0"/>
+              <w:right w:val="single" w:color="000000" w:sz="8" w:space="0"/>
+            </w:tcBorders>
+            <w:tcW w:w="2644" w:type="dxa"/>
+            <w:vMerge w:val="restart"/>
+          </w:tcPr>
+          <w:p>
+            <w:pPr>
+              <w:pStyle w:val="920"/>
+              <w:widowControl w:val="false"/>
+              <w:spacing w:after="0" w:before="0" w:line="240" w:lineRule="auto"/>
+              <w:ind/>
+              <w:jc w:val="left"/>
+              <w:rPr>
+                <w:rFonts w:eastAsia="Calibri" w:cs="Calibri"/>
+                <w:sz w:val="22"/>
+                <w:szCs w:val="22"/>
+                <w:lang w:val="es-AR" w:eastAsia="zh-CN" w:bidi="hi-IN"/>
+              </w:rPr>
+            </w:pPr>
             <w:r>
               <w:rPr>
-                <w:rFonts w:ascii="Calibri" w:hAnsi="Calibri" w:eastAsia="Calibri" w:cs="Calibri"/>
+                <w:rFonts w:eastAsia="Calibri" w:cs="Calibri"/>
+                <w:sz w:val="22"/>
+                <w:szCs w:val="22"/>
+                <w:lang w:val="en-US"/>
+              </w:rPr>
+              <w:t xml:space="preserve">Descarta todo el tr</w:t>
+            </w:r>
+            <w:r>
+              <w:rPr>
+                <w:rFonts w:eastAsia="Calibri" w:cs="Calibri"/>
+                <w:sz w:val="22"/>
+                <w:szCs w:val="22"/>
+                <w:lang w:val="en-US"/>
+              </w:rPr>
+              <w:t xml:space="preserve">áfico restante hacia internet (por eth0)</w:t>
+            </w:r>
+            <w:r>
+              <w:rPr>
+                <w:rFonts w:eastAsia="Calibri" w:cs="Calibri"/>
                 <w:sz w:val="22"/>
                 <w:szCs w:val="22"/>
                 <w:lang w:val="es-AR" w:eastAsia="zh-CN" w:bidi="hi-IN"/>
@@ -1205,7 +1602,7 @@
       <w:tblPr>
         <w:tblStyle w:val="925"/>
         <w:tblInd w:w="283" w:type="dxa"/>
-        <w:tblW w:w="8646" w:type="dxa"/>
+        <w:tblW w:w="8929" w:type="dxa"/>
         <w:tblCellMar>
           <w:left w:w="100" w:type="dxa"/>
           <w:top w:w="100" w:type="dxa"/>
@@ -1217,8 +1614,651 @@
         <w:tblLook w:val="0600" w:firstRow="0" w:lastRow="0" w:firstColumn="0" w:lastColumn="0" w:noHBand="1" w:noVBand="1"/>
       </w:tblPr>
       <w:tblGrid>
+        <w:gridCol w:w="6002"/>
+        <w:gridCol w:w="2928"/>
+      </w:tblGrid>
+      <w:tr>
+        <w:trPr/>
+        <w:tc>
+          <w:tcPr>
+            <w:shd w:val="clear" w:color="auto" w:fill="auto"/>
+            <w:tcBorders>
+              <w:top w:val="single" w:color="000000" w:sz="18" w:space="0"/>
+              <w:left w:val="single" w:color="000000" w:sz="18" w:space="0"/>
+              <w:bottom w:val="single" w:color="000000" w:sz="18" w:space="0"/>
+              <w:right w:val="single" w:color="000000" w:sz="18" w:space="0"/>
+            </w:tcBorders>
+            <w:tcW w:w="6002" w:type="dxa"/>
+          </w:tcPr>
+          <w:p>
+            <w:pPr>
+              <w:pStyle w:val="920"/>
+              <w:widowControl w:val="false"/>
+              <w:spacing w:after="0" w:before="0" w:line="240" w:lineRule="auto"/>
+              <w:ind/>
+              <w:jc w:val="left"/>
+              <w:rPr>
+                <w:b/>
+              </w:rPr>
+            </w:pPr>
+            <w:r>
+              <w:rPr>
+                <w:rFonts w:eastAsia="Calibri" w:cs="Calibri"/>
+                <w:b/>
+                <w:sz w:val="22"/>
+                <w:szCs w:val="22"/>
+                <w:lang w:val="es-AR" w:eastAsia="zh-CN" w:bidi="hi-IN"/>
+              </w:rPr>
+              <w:t xml:space="preserve">Comando (Netfilter/iptables)</w:t>
+            </w:r>
+            <w:r>
+              <w:rPr>
+                <w:b/>
+              </w:rPr>
+            </w:r>
+            <w:r>
+              <w:rPr>
+                <w:b/>
+              </w:rPr>
+            </w:r>
+          </w:p>
+        </w:tc>
+        <w:tc>
+          <w:tcPr>
+            <w:shd w:val="clear" w:color="auto" w:fill="auto"/>
+            <w:tcBorders>
+              <w:top w:val="single" w:color="000000" w:sz="18" w:space="0"/>
+              <w:left w:val="single" w:color="000000" w:sz="18" w:space="0"/>
+              <w:bottom w:val="single" w:color="000000" w:sz="18" w:space="0"/>
+              <w:right w:val="single" w:color="000000" w:sz="18" w:space="0"/>
+            </w:tcBorders>
+            <w:tcW w:w="2928" w:type="dxa"/>
+          </w:tcPr>
+          <w:p>
+            <w:pPr>
+              <w:pStyle w:val="920"/>
+              <w:widowControl w:val="false"/>
+              <w:spacing w:after="0" w:before="0" w:line="240" w:lineRule="auto"/>
+              <w:ind/>
+              <w:jc w:val="left"/>
+              <w:rPr>
+                <w:b/>
+              </w:rPr>
+            </w:pPr>
+            <w:r>
+              <w:rPr>
+                <w:rFonts w:eastAsia="Calibri" w:cs="Calibri"/>
+                <w:b/>
+                <w:sz w:val="22"/>
+                <w:szCs w:val="22"/>
+                <w:lang w:val="es-AR" w:eastAsia="zh-CN" w:bidi="hi-IN"/>
+              </w:rPr>
+              <w:t xml:space="preserve">Descripción </w:t>
+            </w:r>
+            <w:r>
+              <w:rPr>
+                <w:b/>
+              </w:rPr>
+            </w:r>
+            <w:r>
+              <w:rPr>
+                <w:b/>
+              </w:rPr>
+            </w:r>
+          </w:p>
+        </w:tc>
+      </w:tr>
+      <w:tr>
+        <w:trPr/>
+        <w:tc>
+          <w:tcPr>
+            <w:shd w:val="clear" w:color="auto" w:fill="auto"/>
+            <w:tcBorders>
+              <w:top w:val="single" w:color="000000" w:sz="18" w:space="0"/>
+              <w:left w:val="single" w:color="000000" w:sz="8" w:space="0"/>
+              <w:bottom w:val="single" w:color="000000" w:sz="8" w:space="0"/>
+              <w:right w:val="single" w:color="000000" w:sz="8" w:space="0"/>
+            </w:tcBorders>
+            <w:tcW w:w="6002" w:type="dxa"/>
+          </w:tcPr>
+          <w:p>
+            <w:pPr>
+              <w:pStyle w:val="920"/>
+              <w:widowControl w:val="false"/>
+              <w:spacing w:after="0" w:before="0" w:line="240" w:lineRule="auto"/>
+              <w:ind/>
+              <w:jc w:val="left"/>
+              <w:rPr>
+                <w:rFonts w:eastAsia="Calibri" w:cs="Calibri"/>
+                <w:sz w:val="22"/>
+                <w:szCs w:val="22"/>
+                <w:highlight w:val="none"/>
+                <w:lang w:val="es-AR" w:eastAsia="zh-CN" w:bidi="hi-IN"/>
+              </w:rPr>
+            </w:pPr>
+            <w:r>
+              <w:rPr>
+                <w:rFonts w:eastAsia="Calibri" w:cs="Calibri"/>
+                <w:sz w:val="22"/>
+                <w:szCs w:val="22"/>
+                <w:lang w:val="es-AR" w:eastAsia="zh-CN" w:bidi="hi-IN"/>
+              </w:rPr>
+            </w:r>
+            <w:r>
+              <w:rPr>
+                <w:rFonts w:eastAsia="Calibri" w:cs="Calibri"/>
+                <w:sz w:val="22"/>
+                <w:szCs w:val="22"/>
+                <w:lang w:val="es-AR" w:eastAsia="zh-CN" w:bidi="hi-IN"/>
+              </w:rPr>
+              <w:t xml:space="preserve">iptables -t filter -A FORWARD -s 10.2.5.192/28 -d 10.2.5.0/24 -j ACCEPT</w:t>
+            </w:r>
+            <w:r>
+              <w:rPr>
+                <w:rFonts w:eastAsia="Calibri" w:cs="Calibri"/>
+                <w:sz w:val="22"/>
+                <w:szCs w:val="22"/>
+                <w:highlight w:val="none"/>
+                <w:lang w:val="es-AR" w:eastAsia="zh-CN" w:bidi="hi-IN"/>
+              </w:rPr>
+            </w:r>
+            <w:r>
+              <w:rPr>
+                <w:rFonts w:eastAsia="Calibri" w:cs="Calibri"/>
+                <w:sz w:val="22"/>
+                <w:szCs w:val="22"/>
+                <w:highlight w:val="none"/>
+                <w:lang w:val="es-AR" w:eastAsia="zh-CN" w:bidi="hi-IN"/>
+              </w:rPr>
+            </w:r>
+          </w:p>
+        </w:tc>
+        <w:tc>
+          <w:tcPr>
+            <w:shd w:val="clear" w:color="auto" w:fill="auto"/>
+            <w:tcBorders>
+              <w:top w:val="single" w:color="000000" w:sz="18" w:space="0"/>
+              <w:left w:val="single" w:color="000000" w:sz="8" w:space="0"/>
+              <w:bottom w:val="single" w:color="000000" w:sz="8" w:space="0"/>
+              <w:right w:val="single" w:color="000000" w:sz="8" w:space="0"/>
+            </w:tcBorders>
+            <w:tcW w:w="2928" w:type="dxa"/>
+          </w:tcPr>
+          <w:p>
+            <w:pPr>
+              <w:pStyle w:val="920"/>
+              <w:widowControl w:val="false"/>
+              <w:spacing w:after="0" w:before="0" w:line="240" w:lineRule="auto"/>
+              <w:ind/>
+              <w:jc w:val="left"/>
+              <w:rPr>
+                <w:rFonts w:ascii="Calibri" w:hAnsi="Calibri" w:eastAsia="Calibri" w:cs="Calibri"/>
+                <w:sz w:val="22"/>
+                <w:szCs w:val="22"/>
+                <w:lang w:val="es-AR" w:eastAsia="zh-CN" w:bidi="hi-IN"/>
+              </w:rPr>
+            </w:pPr>
+            <w:r>
+              <w:rPr>
+                <w:rFonts w:eastAsia="Calibri" w:cs="Calibri"/>
+                <w:sz w:val="22"/>
+                <w:szCs w:val="22"/>
+                <w:lang w:val="en-US"/>
+              </w:rPr>
+              <w:t xml:space="preserve">Permite el tr</w:t>
+            </w:r>
+            <w:r>
+              <w:rPr>
+                <w:rFonts w:eastAsia="Calibri" w:cs="Calibri"/>
+                <w:sz w:val="22"/>
+                <w:szCs w:val="22"/>
+                <w:lang w:val="en-US"/>
+              </w:rPr>
+              <w:t xml:space="preserve">áfico del </w:t>
+            </w:r>
+            <w:r>
+              <w:rPr>
+                <w:rFonts w:eastAsia="Calibri" w:cs="Calibri"/>
+                <w:sz w:val="22"/>
+                <w:szCs w:val="22"/>
+                <w:lang w:val="en-US"/>
+              </w:rPr>
+              <w:t xml:space="preserve">área de servicio cuando su destino es dentro de la F</w:t>
+            </w:r>
+            <w:r>
+              <w:rPr>
+                <w:rFonts w:eastAsia="Calibri" w:cs="Calibri"/>
+                <w:sz w:val="22"/>
+                <w:szCs w:val="22"/>
+                <w:lang w:val="en-US"/>
+              </w:rPr>
+              <w:t xml:space="preserve">ábrica B</w:t>
+            </w:r>
+            <w:r>
+              <w:rPr>
+                <w:rFonts w:ascii="Calibri" w:hAnsi="Calibri" w:eastAsia="Calibri" w:cs="Calibri"/>
+                <w:sz w:val="22"/>
+                <w:szCs w:val="22"/>
+                <w:lang w:val="es-AR" w:eastAsia="zh-CN" w:bidi="hi-IN"/>
+              </w:rPr>
+            </w:r>
+            <w:r>
+              <w:rPr>
+                <w:rFonts w:ascii="Calibri" w:hAnsi="Calibri" w:eastAsia="Calibri" w:cs="Calibri"/>
+                <w:sz w:val="22"/>
+                <w:szCs w:val="22"/>
+                <w:lang w:val="es-AR" w:eastAsia="zh-CN" w:bidi="hi-IN"/>
+              </w:rPr>
+            </w:r>
+          </w:p>
+        </w:tc>
+      </w:tr>
+      <w:tr>
+        <w:trPr/>
+        <w:tc>
+          <w:tcPr>
+            <w:shd w:val="clear" w:color="ffffff" w:fill="ffffff"/>
+            <w:tcBorders>
+              <w:top w:val="single" w:color="000000" w:sz="18" w:space="0"/>
+              <w:left w:val="single" w:color="000000" w:sz="8" w:space="0"/>
+              <w:bottom w:val="single" w:color="000000" w:sz="8" w:space="0"/>
+              <w:right w:val="single" w:color="000000" w:sz="8" w:space="0"/>
+            </w:tcBorders>
+            <w:tcW w:w="6002" w:type="dxa"/>
+            <w:vMerge w:val="restart"/>
+          </w:tcPr>
+          <w:p>
+            <w:pPr>
+              <w:pStyle w:val="920"/>
+              <w:widowControl w:val="false"/>
+              <w:spacing w:after="0" w:before="0" w:line="240" w:lineRule="auto"/>
+              <w:ind/>
+              <w:jc w:val="left"/>
+              <w:rPr>
+                <w:rFonts w:eastAsia="Calibri" w:cs="Calibri"/>
+                <w:sz w:val="22"/>
+                <w:szCs w:val="22"/>
+                <w:highlight w:val="none"/>
+                <w:lang w:val="es-AR" w:eastAsia="zh-CN" w:bidi="es-AR"/>
+              </w:rPr>
+            </w:pPr>
+            <w:r>
+              <w:rPr>
+                <w:rFonts w:eastAsia="Calibri" w:cs="Calibri"/>
+                <w:sz w:val="22"/>
+                <w:szCs w:val="22"/>
+                <w:highlight w:val="none"/>
+                <w:lang w:val="es-AR" w:eastAsia="zh-CN" w:bidi="es-AR"/>
+              </w:rPr>
+            </w:r>
+            <w:r>
+              <w:rPr>
+                <w:rFonts w:eastAsia="Calibri" w:cs="Calibri"/>
+                <w:sz w:val="22"/>
+                <w:szCs w:val="22"/>
+                <w:highlight w:val="none"/>
+                <w:lang w:val="es-AR" w:eastAsia="zh-CN" w:bidi="es-AR"/>
+              </w:rPr>
+              <w:t xml:space="preserve">iptables -t filter -A FORWARD -s 10.2.5.192/28 -d 10.2.0.0</w:t>
+            </w:r>
+            <w:r>
+              <w:rPr>
+                <w:rFonts w:eastAsia="Calibri" w:cs="Calibri"/>
+                <w:sz w:val="22"/>
+                <w:szCs w:val="22"/>
+                <w:highlight w:val="none"/>
+                <w:lang w:val="en-US"/>
+              </w:rPr>
+              <w:t xml:space="preserve">/</w:t>
+            </w:r>
+            <w:r>
+              <w:rPr>
+                <w:rFonts w:eastAsia="Calibri" w:cs="Calibri"/>
+                <w:sz w:val="22"/>
+                <w:szCs w:val="22"/>
+                <w:highlight w:val="none"/>
+                <w:lang w:val="es-AR" w:eastAsia="zh-CN" w:bidi="es-AR"/>
+              </w:rPr>
+              <w:t xml:space="preserve">23 -j ACCEPT</w:t>
+            </w:r>
+            <w:r>
+              <w:rPr>
+                <w:rFonts w:eastAsia="Calibri" w:cs="Calibri"/>
+                <w:sz w:val="22"/>
+                <w:szCs w:val="22"/>
+                <w:highlight w:val="none"/>
+                <w:lang w:val="es-AR" w:eastAsia="zh-CN" w:bidi="es-AR"/>
+              </w:rPr>
+            </w:r>
+            <w:r>
+              <w:rPr>
+                <w:rFonts w:eastAsia="Calibri" w:cs="Calibri"/>
+                <w:sz w:val="22"/>
+                <w:szCs w:val="22"/>
+                <w:lang w:val="es-AR" w:eastAsia="zh-CN" w:bidi="hi-IN"/>
+              </w:rPr>
+            </w:r>
+            <w:r>
+              <w:rPr>
+                <w:rFonts w:eastAsia="Calibri" w:cs="Calibri"/>
+                <w:sz w:val="22"/>
+                <w:szCs w:val="22"/>
+                <w:lang w:val="es-AR" w:eastAsia="zh-CN" w:bidi="hi-IN"/>
+              </w:rPr>
+            </w:r>
+            <w:r>
+              <w:rPr>
+                <w:rFonts w:eastAsia="Calibri" w:cs="Calibri"/>
+                <w:sz w:val="22"/>
+                <w:szCs w:val="22"/>
+                <w:highlight w:val="none"/>
+                <w:lang w:val="es-AR" w:eastAsia="zh-CN" w:bidi="es-AR"/>
+              </w:rPr>
+            </w:r>
+          </w:p>
+        </w:tc>
+        <w:tc>
+          <w:tcPr>
+            <w:shd w:val="clear" w:color="ffffff" w:fill="ffffff"/>
+            <w:tcBorders>
+              <w:top w:val="single" w:color="000000" w:sz="18" w:space="0"/>
+              <w:left w:val="single" w:color="000000" w:sz="8" w:space="0"/>
+              <w:bottom w:val="single" w:color="000000" w:sz="8" w:space="0"/>
+              <w:right w:val="single" w:color="000000" w:sz="8" w:space="0"/>
+            </w:tcBorders>
+            <w:tcW w:w="2928" w:type="dxa"/>
+            <w:vMerge w:val="restart"/>
+          </w:tcPr>
+          <w:p>
+            <w:pPr>
+              <w:pStyle w:val="920"/>
+              <w:widowControl w:val="false"/>
+              <w:spacing w:after="0" w:before="0" w:line="240" w:lineRule="auto"/>
+              <w:ind/>
+              <w:jc w:val="left"/>
+              <w:rPr>
+                <w:rFonts w:eastAsia="Calibri" w:cs="Calibri"/>
+                <w:sz w:val="22"/>
+                <w:szCs w:val="22"/>
+                <w:lang w:val="es-AR" w:eastAsia="zh-CN" w:bidi="hi-IN"/>
+              </w:rPr>
+            </w:pPr>
+            <w:r>
+              <w:rPr>
+                <w:rFonts w:eastAsia="Calibri" w:cs="Calibri"/>
+                <w:sz w:val="22"/>
+                <w:szCs w:val="22"/>
+                <w:lang w:val="en-US"/>
+              </w:rPr>
+              <w:t xml:space="preserve">Permite el tr</w:t>
+            </w:r>
+            <w:r>
+              <w:rPr>
+                <w:rFonts w:eastAsia="Calibri" w:cs="Calibri"/>
+                <w:sz w:val="22"/>
+                <w:szCs w:val="22"/>
+                <w:lang w:val="en-US"/>
+              </w:rPr>
+              <w:t xml:space="preserve">áfico del </w:t>
+            </w:r>
+            <w:r>
+              <w:rPr>
+                <w:rFonts w:eastAsia="Calibri" w:cs="Calibri"/>
+                <w:sz w:val="22"/>
+                <w:szCs w:val="22"/>
+                <w:lang w:val="en-US"/>
+              </w:rPr>
+              <w:t xml:space="preserve">área de servicio cuando su destino es la red del Datacenter</w:t>
+            </w:r>
+            <w:r>
+              <w:rPr>
+                <w:rFonts w:eastAsia="Calibri" w:cs="Calibri"/>
+                <w:sz w:val="22"/>
+                <w:szCs w:val="22"/>
+                <w:lang w:val="es-AR" w:eastAsia="zh-CN" w:bidi="hi-IN"/>
+              </w:rPr>
+            </w:r>
+          </w:p>
+        </w:tc>
+      </w:tr>
+      <w:tr>
+        <w:trPr/>
+        <w:tc>
+          <w:tcPr>
+            <w:shd w:val="clear" w:color="ffffff" w:fill="ffffff"/>
+            <w:tcBorders>
+              <w:top w:val="single" w:color="000000" w:sz="18" w:space="0"/>
+              <w:left w:val="single" w:color="000000" w:sz="8" w:space="0"/>
+              <w:bottom w:val="single" w:color="000000" w:sz="8" w:space="0"/>
+              <w:right w:val="single" w:color="000000" w:sz="8" w:space="0"/>
+            </w:tcBorders>
+            <w:tcW w:w="6002" w:type="dxa"/>
+            <w:vMerge w:val="restart"/>
+          </w:tcPr>
+          <w:p>
+            <w:pPr>
+              <w:pStyle w:val="920"/>
+              <w:widowControl w:val="false"/>
+              <w:spacing w:after="0" w:before="0" w:line="240" w:lineRule="auto"/>
+              <w:ind/>
+              <w:jc w:val="left"/>
+              <w:rPr>
+                <w:rFonts w:ascii="Calibri" w:hAnsi="Calibri" w:eastAsia="Calibri" w:cs="Calibri"/>
+                <w:sz w:val="22"/>
+                <w:szCs w:val="22"/>
+                <w:lang w:val="es-AR" w:eastAsia="zh-CN" w:bidi="hi-IN"/>
+              </w:rPr>
+            </w:pPr>
+            <w:r>
+              <w:rPr>
+                <w:rFonts w:eastAsia="Calibri" w:cs="Calibri"/>
+                <w:sz w:val="22"/>
+                <w:szCs w:val="22"/>
+                <w:highlight w:val="none"/>
+                <w:lang w:val="es-AR" w:eastAsia="zh-CN" w:bidi="es-AR"/>
+              </w:rPr>
+            </w:r>
+            <w:r>
+              <w:rPr>
+                <w:rFonts w:eastAsia="Calibri" w:cs="Calibri"/>
+                <w:sz w:val="22"/>
+                <w:szCs w:val="22"/>
+                <w:highlight w:val="none"/>
+                <w:lang w:val="es-AR" w:eastAsia="zh-CN" w:bidi="es-AR"/>
+              </w:rPr>
+              <w:t xml:space="preserve">iptables -t filter -A FORWARD -s 10.2.5.192/28 -j REJECT</w:t>
+            </w:r>
+            <w:r>
+              <w:rPr>
+                <w:rFonts w:ascii="Calibri" w:hAnsi="Calibri" w:eastAsia="Calibri" w:cs="Calibri"/>
+                <w:sz w:val="22"/>
+                <w:szCs w:val="22"/>
+                <w:lang w:val="es-AR" w:eastAsia="zh-CN" w:bidi="hi-IN"/>
+              </w:rPr>
+            </w:r>
+            <w:r>
+              <w:rPr>
+                <w:rFonts w:ascii="Calibri" w:hAnsi="Calibri" w:eastAsia="Calibri" w:cs="Calibri"/>
+                <w:sz w:val="22"/>
+                <w:szCs w:val="22"/>
+                <w:lang w:val="es-AR" w:eastAsia="zh-CN" w:bidi="hi-IN"/>
+              </w:rPr>
+            </w:r>
+            <w:r>
+              <w:rPr>
+                <w:rFonts w:eastAsia="Calibri" w:cs="Calibri"/>
+                <w:sz w:val="22"/>
+                <w:szCs w:val="22"/>
+                <w:lang w:val="es-AR" w:eastAsia="zh-CN" w:bidi="hi-IN"/>
+              </w:rPr>
+            </w:r>
+            <w:r>
+              <w:rPr>
+                <w:rFonts w:eastAsia="Calibri" w:cs="Calibri"/>
+                <w:sz w:val="22"/>
+                <w:szCs w:val="22"/>
+                <w:lang w:val="es-AR" w:eastAsia="zh-CN" w:bidi="hi-IN"/>
+              </w:rPr>
+            </w:r>
+            <w:r>
+              <w:rPr>
+                <w:rFonts w:ascii="Calibri" w:hAnsi="Calibri" w:eastAsia="Calibri" w:cs="Calibri"/>
+                <w:sz w:val="22"/>
+                <w:szCs w:val="22"/>
+                <w:lang w:val="es-AR" w:eastAsia="zh-CN" w:bidi="hi-IN"/>
+              </w:rPr>
+            </w:r>
+          </w:p>
+        </w:tc>
+        <w:tc>
+          <w:tcPr>
+            <w:shd w:val="clear" w:color="ffffff" w:fill="ffffff"/>
+            <w:tcBorders>
+              <w:top w:val="single" w:color="000000" w:sz="18" w:space="0"/>
+              <w:left w:val="single" w:color="000000" w:sz="8" w:space="0"/>
+              <w:bottom w:val="single" w:color="000000" w:sz="8" w:space="0"/>
+              <w:right w:val="single" w:color="000000" w:sz="8" w:space="0"/>
+            </w:tcBorders>
+            <w:tcW w:w="2928" w:type="dxa"/>
+            <w:vMerge w:val="restart"/>
+          </w:tcPr>
+          <w:p>
+            <w:pPr>
+              <w:pStyle w:val="920"/>
+              <w:widowControl w:val="false"/>
+              <w:spacing w:after="0" w:before="0" w:line="240" w:lineRule="auto"/>
+              <w:ind/>
+              <w:jc w:val="left"/>
+              <w:rPr>
+                <w:rFonts w:eastAsia="Calibri" w:cs="Calibri"/>
+                <w:sz w:val="22"/>
+                <w:szCs w:val="22"/>
+                <w:lang w:val="es-AR" w:eastAsia="zh-CN" w:bidi="hi-IN"/>
+              </w:rPr>
+            </w:pPr>
+            <w:r>
+              <w:rPr>
+                <w:rFonts w:eastAsia="Calibri" w:cs="Calibri"/>
+                <w:sz w:val="22"/>
+                <w:szCs w:val="22"/>
+                <w:lang w:val="en-US"/>
+              </w:rPr>
+              <w:t xml:space="preserve">Rechaza </w:t>
+            </w:r>
+            <w:r>
+              <w:rPr>
+                <w:rFonts w:eastAsia="Calibri" w:cs="Calibri"/>
+                <w:sz w:val="22"/>
+                <w:szCs w:val="22"/>
+                <w:lang w:val="en-US"/>
+              </w:rPr>
+              <w:t xml:space="preserve">todos los paquetes del </w:t>
+            </w:r>
+            <w:r>
+              <w:rPr>
+                <w:rFonts w:eastAsia="Calibri" w:cs="Calibri"/>
+                <w:sz w:val="22"/>
+                <w:szCs w:val="22"/>
+                <w:lang w:val="en-US"/>
+              </w:rPr>
+              <w:t xml:space="preserve">área de servicio (que no cumplan con las primeras dos reglas)</w:t>
+            </w:r>
+            <w:r>
+              <w:rPr>
+                <w:rFonts w:eastAsia="Calibri" w:cs="Calibri"/>
+                <w:sz w:val="22"/>
+                <w:szCs w:val="22"/>
+                <w:lang w:val="es-AR" w:eastAsia="zh-CN" w:bidi="hi-IN"/>
+              </w:rPr>
+            </w:r>
+          </w:p>
+        </w:tc>
+      </w:tr>
+    </w:tbl>
+    <w:p>
+      <w:pPr>
+        <w:pStyle w:val="920"/>
+        <w:spacing w:after="0" w:before="0" w:line="240" w:lineRule="auto"/>
+        <w:ind/>
+        <w:jc w:val="both"/>
+        <w:rPr>
+          <w:color w:val="000000"/>
+        </w:rPr>
+      </w:pPr>
+      <w:r>
+        <w:rPr>
+          <w:color w:val="000000"/>
+        </w:rPr>
+      </w:r>
+      <w:r>
+        <w:rPr>
+          <w:color w:val="000000"/>
+        </w:rPr>
+      </w:r>
+      <w:r>
+        <w:rPr>
+          <w:color w:val="000000"/>
+        </w:rPr>
+      </w:r>
+    </w:p>
+    <w:p>
+      <w:pPr>
+        <w:pStyle w:val="920"/>
+        <w:numPr>
+          <w:ilvl w:val="0"/>
+          <w:numId w:val="4"/>
+        </w:numPr>
+        <w:spacing w:after="0" w:before="0"/>
+        <w:ind/>
+        <w:jc w:val="both"/>
+        <w:rPr/>
+      </w:pPr>
+      <w:r>
+        <w:rPr>
+          <w:color w:val="000000"/>
+        </w:rPr>
+        <w:t xml:space="preserve">Configurar el</w:t>
+      </w:r>
+      <w:r>
+        <w:t xml:space="preserve"> R8</w:t>
+      </w:r>
+      <w:r>
+        <w:rPr>
+          <w:color w:val="000000"/>
+        </w:rPr>
+        <w:t xml:space="preserve"> para que la PC-Casa pueda acceder a internet.</w:t>
+      </w:r>
+      <w:r/>
+    </w:p>
+    <w:p>
+      <w:pPr>
+        <w:pStyle w:val="920"/>
+        <w:spacing w:after="0" w:before="0" w:line="240" w:lineRule="auto"/>
+        <w:ind w:firstLine="0" w:left="720"/>
+        <w:jc w:val="both"/>
+        <w:rPr/>
+      </w:pPr>
+      <w:r/>
+      <w:r/>
+    </w:p>
+    <w:tbl>
+      <w:tblPr>
+        <w:tblStyle w:val="925"/>
+        <w:tblInd w:w="283" w:type="dxa"/>
+        <w:tblW w:w="8929" w:type="dxa"/>
+        <w:tblCellMar>
+          <w:left w:w="100" w:type="dxa"/>
+          <w:top w:w="100" w:type="dxa"/>
+          <w:right w:w="100" w:type="dxa"/>
+          <w:bottom w:w="100" w:type="dxa"/>
+        </w:tblCellMar>
+        <w:tblBorders/>
+        <w:tblLayout w:type="fixed"/>
+        <w:tblLook w:val="0600" w:firstRow="0" w:lastRow="0" w:firstColumn="0" w:lastColumn="0" w:noHBand="1" w:noVBand="1"/>
+      </w:tblPr>
+      <w:tblGrid>
         <w:gridCol w:w="6001"/>
-        <w:gridCol w:w="2644"/>
+        <w:gridCol w:w="2928"/>
       </w:tblGrid>
       <w:tr>
         <w:trPr/>
@@ -1275,7 +2315,7 @@
               <w:bottom w:val="single" w:color="000000" w:sz="18" w:space="0"/>
               <w:right w:val="single" w:color="000000" w:sz="18" w:space="0"/>
             </w:tcBorders>
-            <w:tcW w:w="2644" w:type="dxa"/>
+            <w:tcW w:w="2928" w:type="dxa"/>
           </w:tcPr>
           <w:p>
             <w:pPr>
@@ -1323,403 +2363,6 @@
               <w:right w:val="single" w:color="000000" w:sz="8" w:space="0"/>
             </w:tcBorders>
             <w:tcW w:w="6001" w:type="dxa"/>
-          </w:tcPr>
-          <w:p>
-            <w:pPr>
-              <w:pStyle w:val="920"/>
-              <w:widowControl w:val="false"/>
-              <w:spacing w:after="0" w:before="0" w:line="240" w:lineRule="auto"/>
-              <w:ind/>
-              <w:jc w:val="left"/>
-              <w:rPr>
-                <w:rFonts w:eastAsia="Calibri" w:cs="Calibri"/>
-                <w:sz w:val="22"/>
-                <w:szCs w:val="22"/>
-                <w:highlight w:val="none"/>
-                <w:lang w:val="es-AR" w:eastAsia="zh-CN" w:bidi="hi-IN"/>
-              </w:rPr>
-            </w:pPr>
-            <w:r>
-              <w:rPr>
-                <w:rFonts w:eastAsia="Calibri" w:cs="Calibri"/>
-                <w:sz w:val="22"/>
-                <w:szCs w:val="22"/>
-                <w:lang w:val="es-AR" w:eastAsia="zh-CN" w:bidi="hi-IN"/>
-              </w:rPr>
-            </w:r>
-            <w:r>
-              <w:rPr>
-                <w:rFonts w:eastAsia="Calibri" w:cs="Calibri"/>
-                <w:sz w:val="22"/>
-                <w:szCs w:val="22"/>
-                <w:lang w:val="es-AR" w:eastAsia="zh-CN" w:bidi="hi-IN"/>
-              </w:rPr>
-              <w:t xml:space="preserve">iptables -t filter -A FORWARD -s 10.2.5.192/28 -d 10.2.5.0/24 -j ACCEPT</w:t>
-            </w:r>
-            <w:r>
-              <w:rPr>
-                <w:rFonts w:eastAsia="Calibri" w:cs="Calibri"/>
-                <w:sz w:val="22"/>
-                <w:szCs w:val="22"/>
-                <w:highlight w:val="none"/>
-                <w:lang w:val="es-AR" w:eastAsia="zh-CN" w:bidi="hi-IN"/>
-              </w:rPr>
-            </w:r>
-            <w:r>
-              <w:rPr>
-                <w:rFonts w:eastAsia="Calibri" w:cs="Calibri"/>
-                <w:sz w:val="22"/>
-                <w:szCs w:val="22"/>
-                <w:highlight w:val="none"/>
-                <w:lang w:val="es-AR" w:eastAsia="zh-CN" w:bidi="hi-IN"/>
-              </w:rPr>
-            </w:r>
-          </w:p>
-          <w:p>
-            <w:pPr>
-              <w:pStyle w:val="920"/>
-              <w:widowControl w:val="false"/>
-              <w:spacing w:after="0" w:before="0" w:line="240" w:lineRule="auto"/>
-              <w:ind/>
-              <w:jc w:val="left"/>
-              <w:rPr>
-                <w:rFonts w:eastAsia="Calibri" w:cs="Calibri"/>
-                <w:sz w:val="22"/>
-                <w:szCs w:val="22"/>
-                <w:highlight w:val="none"/>
-                <w:lang w:val="es-AR" w:eastAsia="zh-CN" w:bidi="es-AR"/>
-              </w:rPr>
-            </w:pPr>
-            <w:r>
-              <w:rPr>
-                <w:rFonts w:eastAsia="Calibri" w:cs="Calibri"/>
-                <w:sz w:val="22"/>
-                <w:szCs w:val="22"/>
-                <w:highlight w:val="none"/>
-                <w:lang w:val="es-AR" w:eastAsia="zh-CN" w:bidi="es-AR"/>
-              </w:rPr>
-            </w:r>
-            <w:r>
-              <w:rPr>
-                <w:rFonts w:eastAsia="Calibri" w:cs="Calibri"/>
-                <w:sz w:val="22"/>
-                <w:szCs w:val="22"/>
-                <w:highlight w:val="none"/>
-                <w:lang w:val="es-AR" w:eastAsia="zh-CN" w:bidi="es-AR"/>
-              </w:rPr>
-              <w:t xml:space="preserve">iptables -t filter -A FORWARD -s 10.2.5.192/28 -d 10.2.0.0.23 -j ACCEPT</w:t>
-            </w:r>
-            <w:r>
-              <w:rPr>
-                <w:rFonts w:eastAsia="Calibri" w:cs="Calibri"/>
-                <w:sz w:val="22"/>
-                <w:szCs w:val="22"/>
-                <w:highlight w:val="none"/>
-                <w:lang w:val="es-AR" w:eastAsia="zh-CN" w:bidi="es-AR"/>
-              </w:rPr>
-            </w:r>
-            <w:r>
-              <w:rPr>
-                <w:rFonts w:eastAsia="Calibri" w:cs="Calibri"/>
-                <w:sz w:val="22"/>
-                <w:szCs w:val="22"/>
-                <w:highlight w:val="none"/>
-                <w:lang w:val="es-AR" w:eastAsia="zh-CN" w:bidi="es-AR"/>
-              </w:rPr>
-            </w:r>
-          </w:p>
-          <w:p>
-            <w:pPr>
-              <w:pStyle w:val="920"/>
-              <w:widowControl w:val="false"/>
-              <w:spacing w:after="0" w:before="0" w:line="240" w:lineRule="auto"/>
-              <w:ind/>
-              <w:jc w:val="left"/>
-              <w:rPr>
-                <w:rFonts w:ascii="Calibri" w:hAnsi="Calibri" w:eastAsia="Calibri" w:cs="Calibri"/>
-                <w:sz w:val="22"/>
-                <w:szCs w:val="22"/>
-                <w:lang w:val="es-AR" w:eastAsia="zh-CN" w:bidi="hi-IN"/>
-              </w:rPr>
-            </w:pPr>
-            <w:r>
-              <w:rPr>
-                <w:rFonts w:eastAsia="Calibri" w:cs="Calibri"/>
-                <w:sz w:val="22"/>
-                <w:szCs w:val="22"/>
-                <w:highlight w:val="none"/>
-                <w:lang w:val="es-AR" w:eastAsia="zh-CN" w:bidi="es-AR"/>
-              </w:rPr>
-            </w:r>
-            <w:r>
-              <w:rPr>
-                <w:rFonts w:eastAsia="Calibri" w:cs="Calibri"/>
-                <w:sz w:val="22"/>
-                <w:szCs w:val="22"/>
-                <w:highlight w:val="none"/>
-                <w:lang w:val="es-AR" w:eastAsia="zh-CN" w:bidi="es-AR"/>
-              </w:rPr>
-              <w:t xml:space="preserve">iptables -t filter -A FORWARD -s 10.2.5.192/28 -j REJECT</w:t>
-            </w:r>
-            <w:r>
-              <w:rPr>
-                <w:rFonts w:ascii="Calibri" w:hAnsi="Calibri" w:eastAsia="Calibri" w:cs="Calibri"/>
-                <w:sz w:val="22"/>
-                <w:szCs w:val="22"/>
-                <w:lang w:val="es-AR" w:eastAsia="zh-CN" w:bidi="hi-IN"/>
-              </w:rPr>
-            </w:r>
-            <w:r>
-              <w:rPr>
-                <w:rFonts w:ascii="Calibri" w:hAnsi="Calibri" w:eastAsia="Calibri" w:cs="Calibri"/>
-                <w:sz w:val="22"/>
-                <w:szCs w:val="22"/>
-                <w:lang w:val="es-AR" w:eastAsia="zh-CN" w:bidi="hi-IN"/>
-              </w:rPr>
-            </w:r>
-          </w:p>
-        </w:tc>
-        <w:tc>
-          <w:tcPr>
-            <w:shd w:val="clear" w:color="auto" w:fill="auto"/>
-            <w:tcBorders>
-              <w:top w:val="single" w:color="000000" w:sz="18" w:space="0"/>
-              <w:left w:val="single" w:color="000000" w:sz="8" w:space="0"/>
-              <w:bottom w:val="single" w:color="000000" w:sz="8" w:space="0"/>
-              <w:right w:val="single" w:color="000000" w:sz="8" w:space="0"/>
-            </w:tcBorders>
-            <w:tcW w:w="2644" w:type="dxa"/>
-          </w:tcPr>
-          <w:p>
-            <w:pPr>
-              <w:pStyle w:val="920"/>
-              <w:widowControl w:val="false"/>
-              <w:spacing w:after="0" w:before="0" w:line="240" w:lineRule="auto"/>
-              <w:ind/>
-              <w:jc w:val="left"/>
-              <w:rPr>
-                <w:rFonts w:ascii="Calibri" w:hAnsi="Calibri" w:eastAsia="Calibri" w:cs="Calibri"/>
-                <w:sz w:val="22"/>
-                <w:szCs w:val="22"/>
-                <w:lang w:val="es-AR" w:eastAsia="zh-CN" w:bidi="hi-IN"/>
-              </w:rPr>
-            </w:pPr>
-            <w:r>
-              <w:rPr>
-                <w:rFonts w:eastAsia="Calibri" w:cs="Calibri"/>
-                <w:sz w:val="22"/>
-                <w:szCs w:val="22"/>
-                <w:lang w:val="es-AR" w:eastAsia="zh-CN" w:bidi="hi-IN"/>
-              </w:rPr>
-            </w:r>
-            <w:r>
-              <w:rPr>
-                <w:rFonts w:ascii="Calibri" w:hAnsi="Calibri" w:eastAsia="Calibri" w:cs="Calibri"/>
-                <w:sz w:val="22"/>
-                <w:szCs w:val="22"/>
-                <w:lang w:val="es-AR" w:eastAsia="zh-CN" w:bidi="hi-IN"/>
-              </w:rPr>
-            </w:r>
-            <w:r>
-              <w:rPr>
-                <w:rFonts w:ascii="Calibri" w:hAnsi="Calibri" w:eastAsia="Calibri" w:cs="Calibri"/>
-                <w:sz w:val="22"/>
-                <w:szCs w:val="22"/>
-                <w:lang w:val="es-AR" w:eastAsia="zh-CN" w:bidi="hi-IN"/>
-              </w:rPr>
-            </w:r>
-          </w:p>
-        </w:tc>
-      </w:tr>
-    </w:tbl>
-    <w:p>
-      <w:pPr>
-        <w:pStyle w:val="920"/>
-        <w:spacing w:after="0" w:before="0" w:line="240" w:lineRule="auto"/>
-        <w:ind/>
-        <w:jc w:val="both"/>
-        <w:rPr>
-          <w:color w:val="000000"/>
-        </w:rPr>
-      </w:pPr>
-      <w:r>
-        <w:rPr>
-          <w:color w:val="000000"/>
-        </w:rPr>
-      </w:r>
-      <w:r>
-        <w:rPr>
-          <w:color w:val="000000"/>
-        </w:rPr>
-      </w:r>
-      <w:r>
-        <w:rPr>
-          <w:color w:val="000000"/>
-        </w:rPr>
-      </w:r>
-    </w:p>
-    <w:p>
-      <w:pPr>
-        <w:pStyle w:val="920"/>
-        <w:numPr>
-          <w:ilvl w:val="0"/>
-          <w:numId w:val="4"/>
-        </w:numPr>
-        <w:spacing w:after="0" w:before="0"/>
-        <w:ind/>
-        <w:jc w:val="both"/>
-        <w:rPr/>
-      </w:pPr>
-      <w:r>
-        <w:rPr>
-          <w:color w:val="000000"/>
-        </w:rPr>
-        <w:t xml:space="preserve">Configurar el</w:t>
-      </w:r>
-      <w:r>
-        <w:t xml:space="preserve"> R8</w:t>
-      </w:r>
-      <w:r>
-        <w:rPr>
-          <w:color w:val="000000"/>
-        </w:rPr>
-        <w:t xml:space="preserve"> para que la PC-Casa pueda acceder a internet.</w:t>
-      </w:r>
-      <w:r/>
-    </w:p>
-    <w:p>
-      <w:pPr>
-        <w:pStyle w:val="920"/>
-        <w:spacing w:after="0" w:before="0" w:line="240" w:lineRule="auto"/>
-        <w:ind w:firstLine="0" w:left="720"/>
-        <w:jc w:val="both"/>
-        <w:rPr/>
-      </w:pPr>
-      <w:r/>
-      <w:r/>
-    </w:p>
-    <w:tbl>
-      <w:tblPr>
-        <w:tblStyle w:val="925"/>
-        <w:tblInd w:w="720" w:type="dxa"/>
-        <w:tblW w:w="7770" w:type="dxa"/>
-        <w:tblCellMar>
-          <w:left w:w="100" w:type="dxa"/>
-          <w:top w:w="100" w:type="dxa"/>
-          <w:right w:w="100" w:type="dxa"/>
-          <w:bottom w:w="100" w:type="dxa"/>
-        </w:tblCellMar>
-        <w:tblBorders/>
-        <w:tblLayout w:type="fixed"/>
-        <w:tblLook w:val="0600" w:firstRow="0" w:lastRow="0" w:firstColumn="0" w:lastColumn="0" w:noHBand="1" w:noVBand="1"/>
-      </w:tblPr>
-      <w:tblGrid>
-        <w:gridCol w:w="5564"/>
-        <w:gridCol w:w="2205"/>
-      </w:tblGrid>
-      <w:tr>
-        <w:trPr/>
-        <w:tc>
-          <w:tcPr>
-            <w:shd w:val="clear" w:color="auto" w:fill="auto"/>
-            <w:tcBorders>
-              <w:top w:val="single" w:color="000000" w:sz="18" w:space="0"/>
-              <w:left w:val="single" w:color="000000" w:sz="18" w:space="0"/>
-              <w:bottom w:val="single" w:color="000000" w:sz="18" w:space="0"/>
-              <w:right w:val="single" w:color="000000" w:sz="18" w:space="0"/>
-            </w:tcBorders>
-            <w:tcW w:w="5564" w:type="dxa"/>
-          </w:tcPr>
-          <w:p>
-            <w:pPr>
-              <w:pStyle w:val="920"/>
-              <w:widowControl w:val="false"/>
-              <w:spacing w:after="0" w:before="0" w:line="240" w:lineRule="auto"/>
-              <w:ind/>
-              <w:jc w:val="left"/>
-              <w:rPr>
-                <w:b/>
-              </w:rPr>
-            </w:pPr>
-            <w:r>
-              <w:rPr>
-                <w:rFonts w:eastAsia="Calibri" w:cs="Calibri"/>
-                <w:b/>
-                <w:sz w:val="22"/>
-                <w:szCs w:val="22"/>
-                <w:lang w:val="es-AR" w:eastAsia="zh-CN" w:bidi="hi-IN"/>
-              </w:rPr>
-              <w:t xml:space="preserve">Comando (Netfilter/iptables)</w:t>
-            </w:r>
-            <w:r>
-              <w:rPr>
-                <w:b/>
-              </w:rPr>
-            </w:r>
-            <w:r>
-              <w:rPr>
-                <w:b/>
-              </w:rPr>
-            </w:r>
-          </w:p>
-        </w:tc>
-        <w:tc>
-          <w:tcPr>
-            <w:shd w:val="clear" w:color="auto" w:fill="auto"/>
-            <w:tcBorders>
-              <w:top w:val="single" w:color="000000" w:sz="18" w:space="0"/>
-              <w:left w:val="single" w:color="000000" w:sz="18" w:space="0"/>
-              <w:bottom w:val="single" w:color="000000" w:sz="18" w:space="0"/>
-              <w:right w:val="single" w:color="000000" w:sz="18" w:space="0"/>
-            </w:tcBorders>
-            <w:tcW w:w="2205" w:type="dxa"/>
-          </w:tcPr>
-          <w:p>
-            <w:pPr>
-              <w:pStyle w:val="920"/>
-              <w:widowControl w:val="false"/>
-              <w:spacing w:after="0" w:before="0" w:line="240" w:lineRule="auto"/>
-              <w:ind/>
-              <w:jc w:val="left"/>
-              <w:rPr>
-                <w:b/>
-              </w:rPr>
-            </w:pPr>
-            <w:r>
-              <w:rPr>
-                <w:rFonts w:eastAsia="Calibri" w:cs="Calibri"/>
-                <w:b/>
-                <w:sz w:val="22"/>
-                <w:szCs w:val="22"/>
-                <w:lang w:val="es-AR" w:eastAsia="zh-CN" w:bidi="hi-IN"/>
-              </w:rPr>
-              <w:t xml:space="preserve">Descripción </w:t>
-            </w:r>
-            <w:r>
-              <w:rPr>
-                <w:b/>
-              </w:rPr>
-            </w:r>
-            <w:r>
-              <w:rPr>
-                <w:b/>
-              </w:rPr>
-            </w:r>
-          </w:p>
-        </w:tc>
-      </w:tr>
-      <w:tr>
-        <w:trPr/>
-        <w:tc>
-          <w:tcPr>
-            <w:shd w:val="clear" w:color="auto" w:fill="auto"/>
-            <w:tcBorders>
-              <w:top w:val="single" w:color="000000" w:sz="18" w:space="0"/>
-              <w:left w:val="single" w:color="000000" w:sz="8" w:space="0"/>
-              <w:bottom w:val="single" w:color="000000" w:sz="8" w:space="0"/>
-              <w:right w:val="single" w:color="000000" w:sz="8" w:space="0"/>
-            </w:tcBorders>
-            <w:tcW w:w="5564" w:type="dxa"/>
           </w:tcPr>
           <w:p>
             <w:pPr>
@@ -1784,7 +2427,7 @@
               <w:bottom w:val="single" w:color="000000" w:sz="8" w:space="0"/>
               <w:right w:val="single" w:color="000000" w:sz="8" w:space="0"/>
             </w:tcBorders>
-            <w:tcW w:w="2205" w:type="dxa"/>
+            <w:tcW w:w="2928" w:type="dxa"/>
           </w:tcPr>
           <w:p>
             <w:pPr>
@@ -1805,16 +2448,36 @@
                 <w:rFonts w:eastAsia="Calibri" w:cs="Calibri"/>
                 <w:sz w:val="22"/>
                 <w:szCs w:val="22"/>
-                <w:lang w:val="es-AR" w:eastAsia="zh-CN" w:bidi="hi-IN"/>
+                <w:lang w:val="en-US"/>
               </w:rPr>
+              <w:t xml:space="preserve">Reemplaza la IP de CasaJefe por la IP p</w:t>
+            </w:r>
+            <w:r>
+              <w:rPr>
+                <w:rFonts w:eastAsia="Calibri" w:cs="Calibri"/>
+                <w:sz w:val="22"/>
+                <w:szCs w:val="22"/>
+                <w:lang w:val="en-US"/>
+              </w:rPr>
+              <w:t xml:space="preserve">ública de R8, permitiendo tr</w:t>
+            </w:r>
+            <w:r>
+              <w:rPr>
+                <w:rFonts w:eastAsia="Calibri" w:cs="Calibri"/>
+                <w:sz w:val="22"/>
+                <w:szCs w:val="22"/>
+                <w:lang w:val="en-US"/>
+              </w:rPr>
+              <w:t xml:space="preserve">áfico a </w:t>
             </w:r>
             <w:r>
               <w:rPr>
                 <w:rFonts w:ascii="Calibri" w:hAnsi="Calibri" w:eastAsia="Calibri" w:cs="Calibri"/>
                 <w:sz w:val="22"/>
                 <w:szCs w:val="22"/>
-                <w:lang w:val="es-AR" w:eastAsia="zh-CN" w:bidi="hi-IN"/>
+                <w:lang w:val="en-US"/>
               </w:rPr>
+              <w:t xml:space="preserve">internet</w:t>
             </w:r>
             <w:r>
               <w:rPr>
@@ -1842,6 +2505,58 @@
     <w:p>
       <w:pPr>
         <w:pStyle w:val="920"/>
+        <w:spacing w:after="0" w:before="0"/>
+        <w:ind w:firstLine="0" w:left="720"/>
+        <w:jc w:val="both"/>
+        <w:rPr/>
+      </w:pPr>
+      <w:r/>
+      <w:r/>
+      <w:r/>
+    </w:p>
+    <w:p>
+      <w:pPr>
+        <w:pStyle w:val="920"/>
+        <w:spacing w:after="0" w:before="0"/>
+        <w:ind w:firstLine="0" w:left="720"/>
+        <w:jc w:val="both"/>
+        <w:rPr/>
+      </w:pPr>
+      <w:r>
+        <w:rPr>
+          <w:highlight w:val="none"/>
+        </w:rPr>
+      </w:r>
+      <w:r>
+        <w:rPr>
+          <w:highlight w:val="none"/>
+        </w:rPr>
+      </w:r>
+      <w:r>
+        <w:rPr>
+          <w:highlight w:val="none"/>
+        </w:rPr>
+      </w:r>
+      <w:r>
+        <w:rPr>
+          <w:highlight w:val="none"/>
+        </w:rPr>
+      </w:r>
+      <w:r>
+        <w:rPr>
+          <w:highlight w:val="none"/>
+        </w:rPr>
+      </w:r>
+      <w:r>
+        <w:rPr>
+          <w:highlight w:val="none"/>
+        </w:rPr>
+      </w:r>
+      <w:r/>
+    </w:p>
+    <w:p>
+      <w:pPr>
+        <w:pStyle w:val="920"/>
         <w:numPr>
           <w:ilvl w:val="0"/>
           <w:numId w:val="4"/>
@@ -1858,35 +2573,44 @@
         <w:t xml:space="preserve">fico proveniente de las fábricas y dirigido al datacenter debe pasar por el router R4 y su respuesta puede regresar por R3 o R4. Además, el tráfico proveniente de las fábricas y dirigido a Internet, debe pasar tanto de ida como de vuelta, por el router R3.</w:t>
       </w:r>
       <w:r/>
+      <w:r>
+        <w:rPr>
+          <w:color w:val="000000"/>
+        </w:rPr>
+      </w:r>
+      <w:r>
+        <w:rPr>
+          <w:color w:val="000000"/>
+        </w:rPr>
+      </w:r>
+      <w:r>
+        <w:rPr>
+          <w:color w:val="000000"/>
+        </w:rPr>
+      </w:r>
+      <w:r/>
     </w:p>
     <w:p>
       <w:pPr>
         <w:pStyle w:val="920"/>
         <w:spacing w:after="0" w:before="0"/>
-        <w:ind/>
-        <w:jc w:val="both"/>
-        <w:rPr/>
+        <w:ind w:hanging="720" w:left="720"/>
+        <w:rPr>
+          <w:color w:val="000000"/>
+        </w:rPr>
       </w:pPr>
       <w:r>
         <w:rPr>
-          <w:highlight w:val="none"/>
+          <w:color w:val="000000"/>
         </w:rPr>
       </w:r>
       <w:r>
         <mc:AlternateContent>
           <mc:Choice Requires="wpg">
             <w:drawing>
-              <wp:anchor xmlns:wp="http://schemas.openxmlformats.org/drawingml/2006/wordprocessingDrawing" xmlns:wp14="http://schemas.microsoft.com/office/word/2010/wordprocessingDrawing" distT="0" distB="0" distL="115200" distR="115200" simplePos="0" relativeHeight="2048" behindDoc="0" locked="0" layoutInCell="1" allowOverlap="1">
-                <wp:simplePos x="0" y="0"/>
-                <wp:positionH relativeFrom="column">
-                  <wp:posOffset>178593</wp:posOffset>
-                </wp:positionH>
-                <wp:positionV relativeFrom="paragraph">
-                  <wp:posOffset>154781</wp:posOffset>
-                </wp:positionV>
+              <wp:inline xmlns:wp="http://schemas.openxmlformats.org/drawingml/2006/wordprocessingDrawing" distT="0" distB="0" distL="0" distR="0">
                 <wp:extent cx="4530876" cy="1047911"/>
                 <wp:effectExtent l="0" t="0" r="0" b="0"/>
-                <wp:wrapNone/>
                 <wp:docPr id="1" name=""/>
                 <wp:cNvGraphicFramePr>
                   <a:graphicFrameLocks xmlns:a="http://schemas.openxmlformats.org/drawingml/2006/main" noChangeAspect="1"/>
@@ -1895,7 +2619,7 @@
                   <a:graphicData uri="http://schemas.openxmlformats.org/drawingml/2006/picture">
                     <pic:pic xmlns:pic="http://schemas.openxmlformats.org/drawingml/2006/picture">
                       <pic:nvPicPr>
-                        <pic:cNvPr id="307551004" name=""/>
+                        <pic:cNvPr id="1237628898" name=""/>
                         <pic:cNvPicPr>
                           <a:picLocks noChangeAspect="1"/>
                         </pic:cNvPicPr>
@@ -1907,9 +2631,9 @@
                         <a:stretch/>
                       </pic:blipFill>
                       <pic:spPr bwMode="auto">
-                        <a:xfrm flipH="0" flipV="0">
+                        <a:xfrm rot="0" flipH="0" flipV="0">
                           <a:off x="0" y="0"/>
-                          <a:ext cx="4530876" cy="1047911"/>
+                          <a:ext cx="4530875" cy="1047910"/>
                         </a:xfrm>
                         <a:prstGeom prst="rect">
                           <a:avLst/>
@@ -1918,7 +2642,7 @@
                     </pic:pic>
                   </a:graphicData>
                 </a:graphic>
-              </wp:anchor>
+              </wp:inline>
             </w:drawing>
           </mc:Choice>
           <mc:Fallback>
@@ -1942,7 +2666,7 @@
                 <v:path o:extrusionok="f" gradientshapeok="t" o:connecttype="rect"/>
                 <o:lock v:ext="edit" aspectratio="t"/>
               </v:shapetype>
-              <v:shape id="_x0000_i0" o:spid="_x0000_s0" type="#_x0000_t75" style="position:absolute;z-index:2048;o:allowoverlap:true;o:allowincell:true;mso-position-horizontal-relative:text;margin-left:14.06pt;mso-position-horizontal:absolute;mso-position-vertical-relative:text;margin-top:12.19pt;mso-position-vertical:absolute;width:356.76pt;height:82.51pt;mso-wrap-distance-left:9.07pt;mso-wrap-distance-top:0.00pt;mso-wrap-distance-right:9.07pt;mso-wrap-distance-bottom:0.00pt;z-index:1;" stroked="false">
+              <v:shape id="_x0000_i0" o:spid="_x0000_s0" type="#_x0000_t75" style="width:356.76pt;height:82.51pt;mso-wrap-distance-left:0.00pt;mso-wrap-distance-top:0.00pt;mso-wrap-distance-right:0.00pt;mso-wrap-distance-bottom:0.00pt;rotation:0;z-index:1;" stroked="false">
                 <v:imagedata r:id="rId10" o:title="" croptop="0f" cropleft="0f" cropbottom="41916f" cropright="0f"/>
                 <o:lock v:ext="edit" rotation="t"/>
               </v:shape>
@@ -1950,122 +2674,6 @@
           </mc:Fallback>
         </mc:AlternateContent>
       </w:r>
-      <w:r>
-        <w:rPr>
-          <w:highlight w:val="none"/>
-        </w:rPr>
-      </w:r>
-      <w:r/>
-    </w:p>
-    <w:p>
-      <w:pPr>
-        <w:pStyle w:val="920"/>
-        <w:spacing w:after="0" w:before="0"/>
-        <w:ind w:hanging="720" w:left="720"/>
-        <w:rPr>
-          <w:color w:val="000000"/>
-        </w:rPr>
-      </w:pPr>
-      <w:r>
-        <w:rPr>
-          <w:color w:val="000000"/>
-        </w:rPr>
-      </w:r>
-      <w:r>
-        <w:rPr>
-          <w:color w:val="000000"/>
-        </w:rPr>
-      </w:r>
-      <w:r>
-        <w:rPr>
-          <w:color w:val="000000"/>
-        </w:rPr>
-      </w:r>
-    </w:p>
-    <w:p>
-      <w:pPr>
-        <w:pStyle w:val="920"/>
-        <w:spacing w:after="0" w:before="0"/>
-        <w:ind w:hanging="720" w:left="720"/>
-        <w:rPr>
-          <w:color w:val="000000"/>
-        </w:rPr>
-      </w:pPr>
-      <w:r>
-        <w:rPr>
-          <w:color w:val="000000"/>
-        </w:rPr>
-      </w:r>
-      <w:r>
-        <w:rPr>
-          <w:color w:val="000000"/>
-        </w:rPr>
-      </w:r>
-      <w:r>
-        <w:rPr>
-          <w:color w:val="000000"/>
-        </w:rPr>
-      </w:r>
-    </w:p>
-    <w:p>
-      <w:pPr>
-        <w:pStyle w:val="920"/>
-        <w:spacing w:after="0" w:before="0"/>
-        <w:ind w:hanging="720" w:left="720"/>
-        <w:rPr>
-          <w:color w:val="000000"/>
-        </w:rPr>
-      </w:pPr>
-      <w:r>
-        <w:rPr>
-          <w:color w:val="000000"/>
-        </w:rPr>
-      </w:r>
-      <w:r>
-        <w:rPr>
-          <w:color w:val="000000"/>
-        </w:rPr>
-      </w:r>
-      <w:r>
-        <w:rPr>
-          <w:color w:val="000000"/>
-        </w:rPr>
-      </w:r>
-    </w:p>
-    <w:p>
-      <w:pPr>
-        <w:pStyle w:val="920"/>
-        <w:spacing w:after="0" w:before="0"/>
-        <w:ind w:hanging="720" w:left="720"/>
-        <w:rPr>
-          <w:color w:val="000000"/>
-        </w:rPr>
-      </w:pPr>
-      <w:r>
-        <w:rPr>
-          <w:color w:val="000000"/>
-        </w:rPr>
-      </w:r>
-      <w:r>
-        <w:rPr>
-          <w:color w:val="000000"/>
-        </w:rPr>
-      </w:r>
-      <w:r>
-        <w:rPr>
-          <w:color w:val="000000"/>
-        </w:rPr>
-      </w:r>
-    </w:p>
-    <w:p>
-      <w:pPr>
-        <w:pStyle w:val="920"/>
-        <w:spacing w:after="0" w:before="0"/>
-        <w:ind w:hanging="720" w:left="720"/>
-        <w:rPr>
-          <w:color w:val="000000"/>
-        </w:rPr>
-      </w:pPr>
       <w:r>
         <w:rPr>
           <w:color w:val="000000"/>
@@ -2138,7 +2746,10 @@
         <w:pStyle w:val="920"/>
         <w:spacing w:after="0" w:before="0"/>
         <w:ind w:right="0" w:firstLine="0" w:left="0"/>
-        <w:rPr/>
+        <w:rPr>
+          <w:highlight w:val="none"/>
+          <w:lang w:val="en-US"/>
+        </w:rPr>
       </w:pPr>
       <w:r>
         <w:t xml:space="preserve">default</w:t>
@@ -2218,124 +2829,25 @@
       <w:pPr>
         <w:pStyle w:val="920"/>
         <w:spacing w:after="0" w:before="0"/>
-        <w:ind w:hanging="720" w:left="720"/>
-        <w:rPr>
-          <w:color w:val="000000"/>
-        </w:rPr>
+        <w:ind w:right="0" w:firstLine="0" w:left="0"/>
+        <w:rPr/>
       </w:pPr>
       <w:r>
         <w:rPr>
-          <w:color w:val="000000"/>
+          <w:highlight w:val="none"/>
+          <w:lang w:val="en-US"/>
         </w:rPr>
       </w:r>
       <w:r>
         <w:rPr>
-          <w:color w:val="000000"/>
+          <w:highlight w:val="none"/>
+          <w:lang w:val="en-US"/>
         </w:rPr>
       </w:r>
       <w:r>
         <w:rPr>
-          <w:color w:val="000000"/>
-        </w:rPr>
-      </w:r>
-    </w:p>
-    <w:p>
-      <w:pPr>
-        <w:pStyle w:val="920"/>
-        <w:spacing w:after="0" w:before="0"/>
-        <w:ind w:hanging="720" w:left="720"/>
-        <w:rPr>
-          <w:color w:val="000000"/>
-        </w:rPr>
-      </w:pPr>
-      <w:r>
-        <w:rPr>
-          <w:color w:val="000000"/>
-        </w:rPr>
-      </w:r>
-      <w:r>
-        <w:rPr>
-          <w:color w:val="000000"/>
-        </w:rPr>
-      </w:r>
-      <w:r>
-        <w:rPr>
-          <w:color w:val="000000"/>
-        </w:rPr>
-      </w:r>
-    </w:p>
-    <w:p>
-      <w:pPr>
-        <w:pStyle w:val="920"/>
-        <w:spacing w:after="0" w:before="0"/>
-        <w:ind w:hanging="720" w:left="720"/>
-        <w:rPr>
-          <w:color w:val="000000"/>
-        </w:rPr>
-      </w:pPr>
-      <w:r>
-        <w:rPr>
-          <w:color w:val="000000"/>
-        </w:rPr>
-      </w:r>
-      <w:r>
-        <w:rPr>
-          <w:color w:val="000000"/>
-        </w:rPr>
-      </w:r>
-      <w:r>
-        <w:rPr>
-          <w:color w:val="000000"/>
-        </w:rPr>
-      </w:r>
-    </w:p>
-    <w:p>
-      <w:pPr>
-        <w:pStyle w:val="920"/>
-        <w:spacing w:after="0" w:before="0"/>
-        <w:ind w:firstLine="0" w:left="0"/>
-        <w:rPr>
-          <w:color w:val="000000"/>
-        </w:rPr>
-      </w:pPr>
-      <w:r>
-        <w:rPr>
-          <w:color w:val="000000"/>
-        </w:rPr>
-      </w:r>
-      <w:r>
-        <w:rPr>
-          <w:color w:val="000000"/>
-        </w:rPr>
-      </w:r>
-      <w:r>
-        <w:rPr>
-          <w:color w:val="000000"/>
-        </w:rPr>
-      </w:r>
-    </w:p>
-    <w:p>
-      <w:pPr>
-        <w:pStyle w:val="920"/>
-        <w:spacing w:after="0" w:before="0"/>
-        <w:ind w:firstLine="0" w:left="0"/>
-        <w:rPr>
-          <w:color w:val="000000"/>
-        </w:rPr>
-      </w:pPr>
-      <w:r>
-        <w:rPr>
-          <w:color w:val="000000"/>
-        </w:rPr>
-      </w:r>
-      <w:r>
-        <w:rPr>
-          <w:color w:val="000000"/>
-        </w:rPr>
-      </w:r>
-      <w:r>
-        <w:rPr>
-          <w:color w:val="000000"/>
+          <w:highlight w:val="none"/>
+          <w:lang w:val="en-US"/>
         </w:rPr>
       </w:r>
     </w:p>
@@ -2507,7 +3019,11 @@
         <w:tab/>
         <w:t xml:space="preserve">Indique para ambos casos, ¿qué dirección IP y qué puertos se deben utilizar? </w:t>
       </w:r>
-      <w:r/>
+      <w:r>
+        <w:rPr>
+          <w:highlight w:val="none"/>
+        </w:rPr>
+      </w:r>
     </w:p>
     <w:p>
       <w:pPr>
@@ -2518,12 +3034,6 @@
           <w:highlight w:val="none"/>
         </w:rPr>
       </w:pPr>
-      <w:r>
-        <w:rPr>
-          <w:highlight w:val="none"/>
-        </w:rPr>
-      </w:r>
-      <w:r/>
       <w:r>
         <w:rPr>
           <w:highlight w:val="none"/>
@@ -2534,7 +3044,11 @@
           <w:highlight w:val="none"/>
         </w:rPr>
       </w:r>
-      <w:r/>
+      <w:r>
+        <w:rPr>
+          <w:highlight w:val="none"/>
+        </w:rPr>
+      </w:r>
     </w:p>
     <w:p>
       <w:pPr>
@@ -2552,6 +3066,12 @@
           <w:lang w:val="en-US"/>
         </w:rPr>
         <w:t xml:space="preserve">Desde PC1:</w:t>
+      </w:r>
+      <w:r>
+        <w:rPr>
+          <w:highlight w:val="none"/>
+          <w:lang w:val="en-US"/>
+        </w:rPr>
       </w:r>
       <w:r>
         <w:rPr>
@@ -2652,7 +3172,7 @@
       <w:r>
         <w:rPr>
           <w:highlight w:val="none"/>
-          <w:lang w:val="en-US" w:bidi="en-US"/>
+          <w:lang w:val="en-US"/>
         </w:rPr>
       </w:r>
       <w:r>
@@ -2759,7 +3279,6 @@
           <w:lang w:val="en-US"/>
         </w:rPr>
       </w:r>
-      <w:r/>
     </w:p>
     <w:p>
       <w:pPr>
@@ -2768,7 +3287,6 @@
         <w:ind w:firstLine="0" w:left="708"/>
         <w:rPr/>
       </w:pPr>
-      <w:r/>
       <w:r/>
       <w:r/>
     </w:p>
@@ -2788,6 +3306,12 @@
           <w:lang w:val="en-US"/>
         </w:rPr>
         <w:t xml:space="preserve">Desde CasaJefe:</w:t>
+      </w:r>
+      <w:r>
+        <w:rPr>
+          <w:highlight w:val="none"/>
+          <w:lang w:val="en-US"/>
+        </w:rPr>
       </w:r>
       <w:r>
         <w:rPr>
@@ -2874,12 +3398,32 @@
         <w:t xml:space="preserve">i</w:t>
       </w:r>
       <w:r>
-        <w:t xml:space="preserve">ptables -t nat -A PREROUTING -i eth0 -p tcp --dport 80 -j DNAT --to-destination 10.2.0.11:8080</w:t>
+        <w:t xml:space="preserve">ptables -t nat -A PREROUTING -i eth0 -p tcp --dport </w:t>
+      </w:r>
+      <w:r>
+        <w:rPr>
+          <w:lang w:val="en-US"/>
+        </w:rPr>
+        <w:t xml:space="preserve">80</w:t>
+      </w:r>
+      <w:r>
+        <w:t xml:space="preserve"> -j DNAT --to-destination 10.2.0.11:</w:t>
+      </w:r>
+      <w:r>
+        <w:rPr>
+          <w:lang w:val="en-US"/>
+        </w:rPr>
+        <w:t xml:space="preserve">8080</w:t>
       </w:r>
       <w:r>
         <w:rPr>
           <w:highlight w:val="none"/>
           <w:lang w:val="en-US"/>
+        </w:rPr>
+      </w:r>
+      <w:r>
+        <w:rPr>
+          <w:highlight w:val="none"/>
         </w:rPr>
       </w:r>
     </w:p>
@@ -2903,7 +3447,7 @@
       <w:r>
         <w:rPr>
           <w:highlight w:val="none"/>
-          <w:lang w:val="en-US" w:bidi="en-US"/>
+          <w:lang w:val="en-US"/>
         </w:rPr>
       </w:r>
       <w:r>
@@ -2932,7 +3476,7 @@
       <w:r>
         <w:rPr>
           <w:highlight w:val="none"/>
-          <w:lang w:val="en-US" w:bidi="en-US"/>
+          <w:lang w:val="en-US"/>
         </w:rPr>
       </w:r>
       <w:r>
@@ -3030,14 +3574,7 @@
       <w:r>
         <w:rPr>
           <w:highlight w:val="none"/>
-          <w:lang w:val="en-US" w:bidi="en-US"/>
-        </w:rPr>
-      </w:r>
-      <w:r/>
-      <w:r>
-        <w:rPr>
-          <w:highlight w:val="none"/>
-          <w:lang w:val="en-US" w:bidi="en-US"/>
+          <w:lang w:val="en-US"/>
         </w:rPr>
       </w:r>
       <w:r>
@@ -3046,23 +3583,6 @@
           <w:lang w:val="en-US" w:bidi="en-US"/>
         </w:rPr>
       </w:r>
-      <w:r>
-        <w:rPr>
-          <w:highlight w:val="none"/>
-          <w:lang w:val="en-US"/>
-        </w:rPr>
-      </w:r>
-    </w:p>
-    <w:p>
-      <w:pPr>
-        <w:pStyle w:val="920"/>
-        <w:spacing w:after="0" w:before="0"/>
-        <w:ind w:firstLine="0" w:left="708"/>
-        <w:rPr>
-          <w:highlight w:val="none"/>
-          <w:lang w:val="en-US"/>
-        </w:rPr>
-      </w:pPr>
       <w:r>
         <w:rPr>
           <w:highlight w:val="none"/>
@@ -3081,46 +3601,12 @@
           <w:lang w:val="en-US"/>
         </w:rPr>
       </w:r>
-    </w:p>
-    <w:p>
-      <w:pPr>
-        <w:pStyle w:val="920"/>
-        <w:spacing w:after="0" w:before="0"/>
-        <w:ind w:firstLine="0" w:left="708"/>
-        <w:rPr>
-          <w:highlight w:val="none"/>
-          <w:lang w:val="en-US"/>
-        </w:rPr>
-      </w:pPr>
       <w:r>
         <w:rPr>
           <w:highlight w:val="none"/>
           <w:lang w:val="en-US" w:bidi="en-US"/>
         </w:rPr>
       </w:r>
-      <w:r>
-        <w:rPr>
-          <w:highlight w:val="none"/>
-          <w:lang w:val="en-US" w:bidi="en-US"/>
-        </w:rPr>
-      </w:r>
-      <w:r>
-        <w:rPr>
-          <w:highlight w:val="none"/>
-          <w:lang w:val="en-US" w:bidi="en-US"/>
-        </w:rPr>
-      </w:r>
-    </w:p>
-    <w:p>
-      <w:pPr>
-        <w:pStyle w:val="920"/>
-        <w:spacing w:after="0" w:before="0"/>
-        <w:ind/>
-        <w:jc w:val="both"/>
-        <w:rPr>
-          <w:color w:val="000000"/>
-        </w:rPr>
-      </w:pPr>
       <w:r>
         <w:rPr>
           <w:color w:val="000000"/>
@@ -3136,6 +3622,12 @@
           <w:color w:val="000000"/>
         </w:rPr>
       </w:r>
+      <w:r>
+        <w:rPr>
+          <w:highlight w:val="none"/>
+          <w:lang w:val="en-US" w:bidi="en-US"/>
+        </w:rPr>
+      </w:r>
     </w:p>
     <w:p>
       <w:pPr>
@@ -3174,6 +3666,260 @@
     <w:p>
       <w:pPr>
         <w:pStyle w:val="920"/>
+        <w:spacing w:after="0" w:before="0"/>
+        <w:ind w:firstLine="0" w:left="1440"/>
+        <w:jc w:val="both"/>
+        <w:rPr/>
+      </w:pPr>
+      <w:r>
+        <w:rPr>
+          <w:highlight w:val="none"/>
+        </w:rPr>
+      </w:r>
+      <w:r>
+        <w:rPr>
+          <w:highlight w:val="none"/>
+        </w:rPr>
+      </w:r>
+      <w:r>
+        <w:rPr>
+          <w:highlight w:val="none"/>
+        </w:rPr>
+      </w:r>
+    </w:p>
+    <w:p>
+      <w:pPr>
+        <w:pStyle w:val="920"/>
+        <w:spacing w:after="0" w:before="0"/>
+        <w:ind w:firstLine="0" w:left="1440"/>
+        <w:jc w:val="both"/>
+        <w:rPr>
+          <w:highlight w:val="none"/>
+        </w:rPr>
+      </w:pPr>
+      <w:r>
+        <w:rPr>
+          <w:highlight w:val="none"/>
+        </w:rPr>
+      </w:r>
+      <w:r>
+        <mc:AlternateContent>
+          <mc:Choice Requires="wpg">
+            <w:drawing>
+              <wp:inline xmlns:wp="http://schemas.openxmlformats.org/drawingml/2006/wordprocessingDrawing" distT="0" distB="0" distL="0" distR="0">
+                <wp:extent cx="4080840" cy="2992616"/>
+                <wp:effectExtent l="0" t="0" r="0" b="0"/>
+                <wp:docPr id="4" name=""/>
+                <wp:cNvGraphicFramePr>
+                  <a:graphicFrameLocks xmlns:a="http://schemas.openxmlformats.org/drawingml/2006/main" noChangeAspect="1"/>
+                </wp:cNvGraphicFramePr>
+                <a:graphic xmlns:a="http://schemas.openxmlformats.org/drawingml/2006/main">
+                  <a:graphicData uri="http://schemas.openxmlformats.org/drawingml/2006/picture">
+                    <pic:pic xmlns:pic="http://schemas.openxmlformats.org/drawingml/2006/picture">
+                      <pic:nvPicPr>
+                        <pic:cNvPr id="2025865403" name=""/>
+                        <pic:cNvPicPr>
+                          <a:picLocks noChangeAspect="1"/>
+                        </pic:cNvPicPr>
+                        <pic:nvPr/>
+                      </pic:nvPicPr>
+                      <pic:blipFill rotWithShape="1">
+                        <a:blip r:embed="rId13"/>
+                        <a:stretch/>
+                      </pic:blipFill>
+                      <pic:spPr bwMode="auto">
+                        <a:xfrm flipH="0" flipV="0">
+                          <a:off x="0" y="0"/>
+                          <a:ext cx="4080839" cy="2992615"/>
+                        </a:xfrm>
+                        <a:prstGeom prst="rect">
+                          <a:avLst/>
+                        </a:prstGeom>
+                      </pic:spPr>
+                    </pic:pic>
+                  </a:graphicData>
+                </a:graphic>
+              </wp:inline>
+            </w:drawing>
+          </mc:Choice>
+          <mc:Fallback>
+            <w:pict>
+              <v:shapetype id="_x0000_t75" coordsize="21600,21600" o:spt="75" o:preferrelative="t" path="m@4@5l@4@11@9@11@9@5xe" filled="f" stroked="f">
+                <v:stroke joinstyle="miter"/>
+                <v:formulas>
+                  <v:f eqn="if lineDrawn pixelLineWidth 0"/>
+                  <v:f eqn="sum @0 1 0"/>
+                  <v:f eqn="sum 0 0 @1"/>
+                  <v:f eqn="prod @2 1 2"/>
+                  <v:f eqn="prod @3 21600 pixelWidth"/>
+                  <v:f eqn="prod @3 21600 pixelHeight"/>
+                  <v:f eqn="sum @0 0 1"/>
+                  <v:f eqn="prod @6 1 2"/>
+                  <v:f eqn="prod @7 21600 pixelWidth"/>
+                  <v:f eqn="sum @8 21600 0"/>
+                  <v:f eqn="prod @7 21600 pixelHeight"/>
+                  <v:f eqn="sum @10 21600 0"/>
+                </v:formulas>
+                <v:path o:extrusionok="f" gradientshapeok="t" o:connecttype="rect"/>
+                <o:lock v:ext="edit" aspectratio="t"/>
+              </v:shapetype>
+              <v:shape id="_x0000_i3" o:spid="_x0000_s3" type="#_x0000_t75" style="width:321.33pt;height:235.64pt;mso-wrap-distance-left:0.00pt;mso-wrap-distance-top:0.00pt;mso-wrap-distance-right:0.00pt;mso-wrap-distance-bottom:0.00pt;z-index:1;" stroked="false">
+                <v:imagedata r:id="rId13" o:title=""/>
+                <o:lock v:ext="edit" rotation="t"/>
+              </v:shape>
+            </w:pict>
+          </mc:Fallback>
+        </mc:AlternateContent>
+      </w:r>
+      <w:r>
+        <w:rPr>
+          <w:highlight w:val="none"/>
+        </w:rPr>
+      </w:r>
+      <w:r/>
+      <w:r>
+        <w:rPr>
+          <w:highlight w:val="none"/>
+        </w:rPr>
+      </w:r>
+      <w:r>
+        <w:rPr>
+          <w:highlight w:val="none"/>
+        </w:rPr>
+      </w:r>
+      <w:r>
+        <w:rPr>
+          <w:highlight w:val="none"/>
+        </w:rPr>
+      </w:r>
+    </w:p>
+    <w:p>
+      <w:pPr>
+        <w:pStyle w:val="920"/>
+        <w:spacing w:after="0" w:before="0"/>
+        <w:ind w:firstLine="0" w:left="1440"/>
+        <w:jc w:val="both"/>
+        <w:rPr>
+          <w:highlight w:val="none"/>
+        </w:rPr>
+      </w:pPr>
+      <w:r>
+        <w:rPr>
+          <w:highlight w:val="none"/>
+        </w:rPr>
+      </w:r>
+      <w:r>
+        <mc:AlternateContent>
+          <mc:Choice Requires="wpg">
+            <w:drawing>
+              <wp:inline xmlns:wp="http://schemas.openxmlformats.org/drawingml/2006/wordprocessingDrawing" distT="0" distB="0" distL="0" distR="0">
+                <wp:extent cx="4080840" cy="1891926"/>
+                <wp:effectExtent l="0" t="0" r="0" b="0"/>
+                <wp:docPr id="5" name=""/>
+                <wp:cNvGraphicFramePr>
+                  <a:graphicFrameLocks xmlns:a="http://schemas.openxmlformats.org/drawingml/2006/main" noChangeAspect="1"/>
+                </wp:cNvGraphicFramePr>
+                <a:graphic xmlns:a="http://schemas.openxmlformats.org/drawingml/2006/main">
+                  <a:graphicData uri="http://schemas.openxmlformats.org/drawingml/2006/picture">
+                    <pic:pic xmlns:pic="http://schemas.openxmlformats.org/drawingml/2006/picture">
+                      <pic:nvPicPr>
+                        <pic:cNvPr id="1295989745" name=""/>
+                        <pic:cNvPicPr>
+                          <a:picLocks noChangeAspect="1"/>
+                        </pic:cNvPicPr>
+                        <pic:nvPr/>
+                      </pic:nvPicPr>
+                      <pic:blipFill rotWithShape="1">
+                        <a:blip r:embed="rId14"/>
+                        <a:stretch/>
+                      </pic:blipFill>
+                      <pic:spPr bwMode="auto">
+                        <a:xfrm flipH="0" flipV="0">
+                          <a:off x="0" y="0"/>
+                          <a:ext cx="4080839" cy="1891925"/>
+                        </a:xfrm>
+                        <a:prstGeom prst="rect">
+                          <a:avLst/>
+                        </a:prstGeom>
+                      </pic:spPr>
+                    </pic:pic>
+                  </a:graphicData>
+                </a:graphic>
+              </wp:inline>
+            </w:drawing>
+          </mc:Choice>
+          <mc:Fallback>
+            <w:pict>
+              <v:shapetype id="_x0000_t75" coordsize="21600,21600" o:spt="75" o:preferrelative="t" path="m@4@5l@4@11@9@11@9@5xe" filled="f" stroked="f">
+                <v:stroke joinstyle="miter"/>
+                <v:formulas>
+                  <v:f eqn="if lineDrawn pixelLineWidth 0"/>
+                  <v:f eqn="sum @0 1 0"/>
+                  <v:f eqn="sum 0 0 @1"/>
+                  <v:f eqn="prod @2 1 2"/>
+                  <v:f eqn="prod @3 21600 pixelWidth"/>
+                  <v:f eqn="prod @3 21600 pixelHeight"/>
+                  <v:f eqn="sum @0 0 1"/>
+                  <v:f eqn="prod @6 1 2"/>
+                  <v:f eqn="prod @7 21600 pixelWidth"/>
+                  <v:f eqn="sum @8 21600 0"/>
+                  <v:f eqn="prod @7 21600 pixelHeight"/>
+                  <v:f eqn="sum @10 21600 0"/>
+                </v:formulas>
+                <v:path o:extrusionok="f" gradientshapeok="t" o:connecttype="rect"/>
+                <o:lock v:ext="edit" aspectratio="t"/>
+              </v:shapetype>
+              <v:shape id="_x0000_i4" o:spid="_x0000_s4" type="#_x0000_t75" style="width:321.33pt;height:148.97pt;mso-wrap-distance-left:0.00pt;mso-wrap-distance-top:0.00pt;mso-wrap-distance-right:0.00pt;mso-wrap-distance-bottom:0.00pt;z-index:1;" stroked="false">
+                <v:imagedata r:id="rId14" o:title=""/>
+                <o:lock v:ext="edit" rotation="t"/>
+              </v:shape>
+            </w:pict>
+          </mc:Fallback>
+        </mc:AlternateContent>
+      </w:r>
+      <w:r>
+        <w:rPr>
+          <w:highlight w:val="none"/>
+        </w:rPr>
+      </w:r>
+      <w:r>
+        <w:rPr>
+          <w:highlight w:val="none"/>
+        </w:rPr>
+      </w:r>
+      <w:r>
+        <w:rPr>
+          <w:highlight w:val="none"/>
+        </w:rPr>
+      </w:r>
+    </w:p>
+    <w:p>
+      <w:pPr>
+        <w:pStyle w:val="920"/>
+        <w:spacing w:after="0" w:before="0"/>
+        <w:ind w:firstLine="0" w:left="1440"/>
+        <w:jc w:val="both"/>
+        <w:rPr/>
+      </w:pPr>
+      <w:r>
+        <w:rPr>
+          <w:highlight w:val="none"/>
+        </w:rPr>
+      </w:r>
+      <w:r>
+        <w:rPr>
+          <w:highlight w:val="none"/>
+        </w:rPr>
+      </w:r>
+      <w:r>
+        <w:rPr>
+          <w:highlight w:val="none"/>
+        </w:rPr>
+      </w:r>
+    </w:p>
+    <w:p>
+      <w:pPr>
+        <w:pStyle w:val="920"/>
         <w:numPr>
           <w:ilvl w:val="0"/>
           <w:numId w:val="5"/>
@@ -3192,6 +3938,296 @@
       <w:pPr>
         <w:pStyle w:val="920"/>
         <w:spacing w:after="0" w:before="0" w:line="240" w:lineRule="auto"/>
+        <w:ind w:firstLine="0" w:left="1440"/>
+        <w:jc w:val="both"/>
+        <w:rPr>
+          <w:highlight w:val="none"/>
+        </w:rPr>
+      </w:pPr>
+      <w:r>
+        <w:rPr>
+          <w:highlight w:val="none"/>
+        </w:rPr>
+      </w:r>
+      <w:r>
+        <mc:AlternateContent>
+          <mc:Choice Requires="wpg">
+            <w:drawing>
+              <wp:inline xmlns:wp="http://schemas.openxmlformats.org/drawingml/2006/wordprocessingDrawing" distT="0" distB="0" distL="0" distR="0">
+                <wp:extent cx="4080840" cy="1822297"/>
+                <wp:effectExtent l="0" t="0" r="0" b="0"/>
+                <wp:docPr id="6" name=""/>
+                <wp:cNvGraphicFramePr>
+                  <a:graphicFrameLocks xmlns:a="http://schemas.openxmlformats.org/drawingml/2006/main" noChangeAspect="1"/>
+                </wp:cNvGraphicFramePr>
+                <a:graphic xmlns:a="http://schemas.openxmlformats.org/drawingml/2006/main">
+                  <a:graphicData uri="http://schemas.openxmlformats.org/drawingml/2006/picture">
+                    <pic:pic xmlns:pic="http://schemas.openxmlformats.org/drawingml/2006/picture">
+                      <pic:nvPicPr>
+                        <pic:cNvPr id="118995684" name=""/>
+                        <pic:cNvPicPr>
+                          <a:picLocks noChangeAspect="1"/>
+                        </pic:cNvPicPr>
+                        <pic:nvPr/>
+                      </pic:nvPicPr>
+                      <pic:blipFill rotWithShape="1">
+                        <a:blip r:embed="rId15"/>
+                        <a:stretch/>
+                      </pic:blipFill>
+                      <pic:spPr bwMode="auto">
+                        <a:xfrm flipH="0" flipV="0">
+                          <a:off x="0" y="0"/>
+                          <a:ext cx="4080839" cy="1822296"/>
+                        </a:xfrm>
+                        <a:prstGeom prst="rect">
+                          <a:avLst/>
+                        </a:prstGeom>
+                      </pic:spPr>
+                    </pic:pic>
+                  </a:graphicData>
+                </a:graphic>
+              </wp:inline>
+            </w:drawing>
+          </mc:Choice>
+          <mc:Fallback>
+            <w:pict>
+              <v:shapetype id="_x0000_t75" coordsize="21600,21600" o:spt="75" o:preferrelative="t" path="m@4@5l@4@11@9@11@9@5xe" filled="f" stroked="f">
+                <v:stroke joinstyle="miter"/>
+                <v:formulas>
+                  <v:f eqn="if lineDrawn pixelLineWidth 0"/>
+                  <v:f eqn="sum @0 1 0"/>
+                  <v:f eqn="sum 0 0 @1"/>
+                  <v:f eqn="prod @2 1 2"/>
+                  <v:f eqn="prod @3 21600 pixelWidth"/>
+                  <v:f eqn="prod @3 21600 pixelHeight"/>
+                  <v:f eqn="sum @0 0 1"/>
+                  <v:f eqn="prod @6 1 2"/>
+                  <v:f eqn="prod @7 21600 pixelWidth"/>
+                  <v:f eqn="sum @8 21600 0"/>
+                  <v:f eqn="prod @7 21600 pixelHeight"/>
+                  <v:f eqn="sum @10 21600 0"/>
+                </v:formulas>
+                <v:path o:extrusionok="f" gradientshapeok="t" o:connecttype="rect"/>
+                <o:lock v:ext="edit" aspectratio="t"/>
+              </v:shapetype>
+              <v:shape id="_x0000_i5" o:spid="_x0000_s5" type="#_x0000_t75" style="width:321.33pt;height:143.49pt;mso-wrap-distance-left:0.00pt;mso-wrap-distance-top:0.00pt;mso-wrap-distance-right:0.00pt;mso-wrap-distance-bottom:0.00pt;z-index:1;" stroked="false">
+                <v:imagedata r:id="rId15" o:title=""/>
+                <o:lock v:ext="edit" rotation="t"/>
+              </v:shape>
+            </w:pict>
+          </mc:Fallback>
+        </mc:AlternateContent>
+      </w:r>
+      <w:r>
+        <w:rPr>
+          <w:highlight w:val="none"/>
+        </w:rPr>
+      </w:r>
+      <w:r>
+        <w:rPr>
+          <w:highlight w:val="none"/>
+        </w:rPr>
+      </w:r>
+      <w:r/>
+    </w:p>
+    <w:p>
+      <w:pPr>
+        <w:pStyle w:val="920"/>
+        <w:spacing w:after="0" w:before="0" w:line="240" w:lineRule="auto"/>
+        <w:ind w:firstLine="0" w:left="1440"/>
+        <w:jc w:val="both"/>
+        <w:rPr>
+          <w:highlight w:val="none"/>
+        </w:rPr>
+      </w:pPr>
+      <w:r>
+        <w:rPr>
+          <w:highlight w:val="none"/>
+        </w:rPr>
+      </w:r>
+      <w:r>
+        <mc:AlternateContent>
+          <mc:Choice Requires="wpg">
+            <w:drawing>
+              <wp:inline xmlns:wp="http://schemas.openxmlformats.org/drawingml/2006/wordprocessingDrawing" distT="0" distB="0" distL="0" distR="0">
+                <wp:extent cx="4080840" cy="2997679"/>
+                <wp:effectExtent l="0" t="0" r="0" b="0"/>
+                <wp:docPr id="7" name=""/>
+                <wp:cNvGraphicFramePr>
+                  <a:graphicFrameLocks xmlns:a="http://schemas.openxmlformats.org/drawingml/2006/main" noChangeAspect="1"/>
+                </wp:cNvGraphicFramePr>
+                <a:graphic xmlns:a="http://schemas.openxmlformats.org/drawingml/2006/main">
+                  <a:graphicData uri="http://schemas.openxmlformats.org/drawingml/2006/picture">
+                    <pic:pic xmlns:pic="http://schemas.openxmlformats.org/drawingml/2006/picture">
+                      <pic:nvPicPr>
+                        <pic:cNvPr id="1706971993" name=""/>
+                        <pic:cNvPicPr>
+                          <a:picLocks noChangeAspect="1"/>
+                        </pic:cNvPicPr>
+                        <pic:nvPr/>
+                      </pic:nvPicPr>
+                      <pic:blipFill rotWithShape="1">
+                        <a:blip r:embed="rId16"/>
+                        <a:stretch/>
+                      </pic:blipFill>
+                      <pic:spPr bwMode="auto">
+                        <a:xfrm flipH="0" flipV="0">
+                          <a:off x="0" y="0"/>
+                          <a:ext cx="4080839" cy="2997678"/>
+                        </a:xfrm>
+                        <a:prstGeom prst="rect">
+                          <a:avLst/>
+                        </a:prstGeom>
+                      </pic:spPr>
+                    </pic:pic>
+                  </a:graphicData>
+                </a:graphic>
+              </wp:inline>
+            </w:drawing>
+          </mc:Choice>
+          <mc:Fallback>
+            <w:pict>
+              <v:shapetype id="_x0000_t75" coordsize="21600,21600" o:spt="75" o:preferrelative="t" path="m@4@5l@4@11@9@11@9@5xe" filled="f" stroked="f">
+                <v:stroke joinstyle="miter"/>
+                <v:formulas>
+                  <v:f eqn="if lineDrawn pixelLineWidth 0"/>
+                  <v:f eqn="sum @0 1 0"/>
+                  <v:f eqn="sum 0 0 @1"/>
+                  <v:f eqn="prod @2 1 2"/>
+                  <v:f eqn="prod @3 21600 pixelWidth"/>
+                  <v:f eqn="prod @3 21600 pixelHeight"/>
+                  <v:f eqn="sum @0 0 1"/>
+                  <v:f eqn="prod @6 1 2"/>
+                  <v:f eqn="prod @7 21600 pixelWidth"/>
+                  <v:f eqn="sum @8 21600 0"/>
+                  <v:f eqn="prod @7 21600 pixelHeight"/>
+                  <v:f eqn="sum @10 21600 0"/>
+                </v:formulas>
+                <v:path o:extrusionok="f" gradientshapeok="t" o:connecttype="rect"/>
+                <o:lock v:ext="edit" aspectratio="t"/>
+              </v:shapetype>
+              <v:shape id="_x0000_i6" o:spid="_x0000_s6" type="#_x0000_t75" style="width:321.33pt;height:236.04pt;mso-wrap-distance-left:0.00pt;mso-wrap-distance-top:0.00pt;mso-wrap-distance-right:0.00pt;mso-wrap-distance-bottom:0.00pt;z-index:1;" stroked="false">
+                <v:imagedata r:id="rId16" o:title=""/>
+                <o:lock v:ext="edit" rotation="t"/>
+              </v:shape>
+            </w:pict>
+          </mc:Fallback>
+        </mc:AlternateContent>
+      </w:r>
+      <w:r>
+        <w:rPr>
+          <w:highlight w:val="none"/>
+        </w:rPr>
+      </w:r>
+      <w:r>
+        <w:rPr>
+          <w:highlight w:val="none"/>
+        </w:rPr>
+      </w:r>
+      <w:r/>
+    </w:p>
+    <w:p>
+      <w:pPr>
+        <w:pStyle w:val="920"/>
+        <w:spacing w:after="0" w:before="0" w:line="240" w:lineRule="auto"/>
+        <w:ind w:firstLine="0" w:left="1440"/>
+        <w:jc w:val="both"/>
+        <w:rPr/>
+      </w:pPr>
+      <w:r>
+        <w:rPr>
+          <w:highlight w:val="none"/>
+        </w:rPr>
+      </w:r>
+      <w:r>
+        <mc:AlternateContent>
+          <mc:Choice Requires="wpg">
+            <w:drawing>
+              <wp:inline xmlns:wp="http://schemas.openxmlformats.org/drawingml/2006/wordprocessingDrawing" distT="0" distB="0" distL="0" distR="0">
+                <wp:extent cx="4080840" cy="741606"/>
+                <wp:effectExtent l="0" t="0" r="0" b="0"/>
+                <wp:docPr id="8" name=""/>
+                <wp:cNvGraphicFramePr>
+                  <a:graphicFrameLocks xmlns:a="http://schemas.openxmlformats.org/drawingml/2006/main" noChangeAspect="1"/>
+                </wp:cNvGraphicFramePr>
+                <a:graphic xmlns:a="http://schemas.openxmlformats.org/drawingml/2006/main">
+                  <a:graphicData uri="http://schemas.openxmlformats.org/drawingml/2006/picture">
+                    <pic:pic xmlns:pic="http://schemas.openxmlformats.org/drawingml/2006/picture">
+                      <pic:nvPicPr>
+                        <pic:cNvPr id="355623105" name=""/>
+                        <pic:cNvPicPr>
+                          <a:picLocks noChangeAspect="1"/>
+                        </pic:cNvPicPr>
+                        <pic:nvPr/>
+                      </pic:nvPicPr>
+                      <pic:blipFill rotWithShape="1">
+                        <a:blip r:embed="rId17"/>
+                        <a:stretch/>
+                      </pic:blipFill>
+                      <pic:spPr bwMode="auto">
+                        <a:xfrm flipH="0" flipV="0">
+                          <a:off x="0" y="0"/>
+                          <a:ext cx="4080839" cy="741606"/>
+                        </a:xfrm>
+                        <a:prstGeom prst="rect">
+                          <a:avLst/>
+                        </a:prstGeom>
+                      </pic:spPr>
+                    </pic:pic>
+                  </a:graphicData>
+                </a:graphic>
+              </wp:inline>
+            </w:drawing>
+          </mc:Choice>
+          <mc:Fallback>
+            <w:pict>
+              <v:shapetype id="_x0000_t75" coordsize="21600,21600" o:spt="75" o:preferrelative="t" path="m@4@5l@4@11@9@11@9@5xe" filled="f" stroked="f">
+                <v:stroke joinstyle="miter"/>
+                <v:formulas>
+                  <v:f eqn="if lineDrawn pixelLineWidth 0"/>
+                  <v:f eqn="sum @0 1 0"/>
+                  <v:f eqn="sum 0 0 @1"/>
+                  <v:f eqn="prod @2 1 2"/>
+                  <v:f eqn="prod @3 21600 pixelWidth"/>
+                  <v:f eqn="prod @3 21600 pixelHeight"/>
+                  <v:f eqn="sum @0 0 1"/>
+                  <v:f eqn="prod @6 1 2"/>
+                  <v:f eqn="prod @7 21600 pixelWidth"/>
+                  <v:f eqn="sum @8 21600 0"/>
+                  <v:f eqn="prod @7 21600 pixelHeight"/>
+                  <v:f eqn="sum @10 21600 0"/>
+                </v:formulas>
+                <v:path o:extrusionok="f" gradientshapeok="t" o:connecttype="rect"/>
+                <o:lock v:ext="edit" aspectratio="t"/>
+              </v:shapetype>
+              <v:shape id="_x0000_i7" o:spid="_x0000_s7" type="#_x0000_t75" style="width:321.33pt;height:58.39pt;mso-wrap-distance-left:0.00pt;mso-wrap-distance-top:0.00pt;mso-wrap-distance-right:0.00pt;mso-wrap-distance-bottom:0.00pt;z-index:1;" stroked="false">
+                <v:imagedata r:id="rId17" o:title=""/>
+                <o:lock v:ext="edit" rotation="t"/>
+              </v:shape>
+            </w:pict>
+          </mc:Fallback>
+        </mc:AlternateContent>
+      </w:r>
+      <w:r>
+        <w:rPr>
+          <w:highlight w:val="none"/>
+        </w:rPr>
+      </w:r>
+      <w:r>
+        <w:rPr>
+          <w:highlight w:val="none"/>
+        </w:rPr>
+      </w:r>
+      <w:r>
+        <w:rPr>
+          <w:highlight w:val="none"/>
+        </w:rPr>
+      </w:r>
+    </w:p>
+    <w:p>
+      <w:pPr>
+        <w:pStyle w:val="920"/>
+        <w:spacing w:after="0" w:before="0" w:line="240" w:lineRule="auto"/>
         <w:ind/>
         <w:jc w:val="both"/>
         <w:rPr/>
@@ -3262,6 +4298,604 @@
         <w:t xml:space="preserve">Diferencie en un párrafo, por qué aparecen diferentes protocolos</w:t>
       </w:r>
       <w:r/>
+    </w:p>
+    <w:p>
+      <w:pPr>
+        <w:pStyle w:val="920"/>
+        <w:spacing w:after="0" w:before="0" w:line="240" w:lineRule="auto"/>
+        <w:ind/>
+        <w:jc w:val="both"/>
+        <w:rPr/>
+      </w:pPr>
+      <w:r/>
+      <w:r/>
+      <w:r/>
+    </w:p>
+    <w:p>
+      <w:pPr>
+        <w:spacing/>
+        <w:ind w:right="0" w:firstLine="0" w:left="0"/>
+        <w:jc w:val="left"/>
+        <w:rPr>
+          <w:rFonts w:ascii="Calibri" w:hAnsi="Calibri" w:eastAsia="Calibri" w:cs="Calibri"/>
+          <w:b w:val="0"/>
+          <w:bCs w:val="0"/>
+          <w:i w:val="0"/>
+          <w:color w:val="000000"/>
+          <w:sz w:val="22"/>
+          <w:szCs w:val="22"/>
+        </w:rPr>
+      </w:pPr>
+      <w:r>
+        <w:rPr>
+          <w:rFonts w:ascii="Calibri" w:hAnsi="Calibri" w:eastAsia="Calibri" w:cs="Calibri"/>
+          <w:b w:val="0"/>
+          <w:bCs w:val="0"/>
+          <w:i w:val="0"/>
+          <w:iCs w:val="0"/>
+          <w:color w:val="000000"/>
+          <w:sz w:val="22"/>
+          <w:szCs w:val="20"/>
+        </w:rPr>
+        <w:t xml:space="preserve">Primera captura (</w:t>
+      </w:r>
+      <w:r>
+        <w:rPr>
+          <w:rFonts w:ascii="Calibri" w:hAnsi="Calibri" w:eastAsia="Calibri" w:cs="Calibri"/>
+          <w:b w:val="0"/>
+          <w:bCs w:val="0"/>
+          <w:i w:val="0"/>
+          <w:iCs w:val="0"/>
+          <w:color w:val="000000"/>
+          <w:sz w:val="22"/>
+          <w:szCs w:val="20"/>
+          <w:lang w:val="en-US"/>
+        </w:rPr>
+        <w:t xml:space="preserve">captura.pcap</w:t>
+      </w:r>
+      <w:r>
+        <w:rPr>
+          <w:rFonts w:ascii="Calibri" w:hAnsi="Calibri" w:eastAsia="Calibri" w:cs="Calibri"/>
+          <w:b w:val="0"/>
+          <w:bCs w:val="0"/>
+          <w:i w:val="0"/>
+          <w:iCs w:val="0"/>
+          <w:color w:val="000000"/>
+          <w:sz w:val="22"/>
+          <w:szCs w:val="20"/>
+        </w:rPr>
+        <w:t xml:space="preserve">):</w:t>
+      </w:r>
+      <w:r>
+        <w:rPr>
+          <w:rFonts w:ascii="Calibri" w:hAnsi="Calibri" w:eastAsia="Calibri" w:cs="Calibri"/>
+          <w:b w:val="0"/>
+          <w:bCs w:val="0"/>
+          <w:i w:val="0"/>
+          <w:iCs w:val="0"/>
+          <w:color w:val="000000"/>
+          <w:sz w:val="22"/>
+          <w:szCs w:val="20"/>
+        </w:rPr>
+        <w:t xml:space="preserve"> Intervienen el protocolo </w:t>
+      </w:r>
+      <w:r>
+        <w:rPr>
+          <w:rFonts w:ascii="Calibri" w:hAnsi="Calibri" w:eastAsia="Calibri" w:cs="Calibri"/>
+          <w:b w:val="0"/>
+          <w:bCs w:val="0"/>
+          <w:i w:val="0"/>
+          <w:iCs w:val="0"/>
+          <w:color w:val="000000"/>
+          <w:sz w:val="22"/>
+          <w:szCs w:val="20"/>
+        </w:rPr>
+        <w:t xml:space="preserve">ARP</w:t>
+      </w:r>
+      <w:r>
+        <w:rPr>
+          <w:rFonts w:ascii="Calibri" w:hAnsi="Calibri" w:eastAsia="Calibri" w:cs="Calibri"/>
+          <w:b w:val="0"/>
+          <w:bCs w:val="0"/>
+          <w:i w:val="0"/>
+          <w:iCs w:val="0"/>
+          <w:color w:val="000000"/>
+          <w:sz w:val="22"/>
+          <w:szCs w:val="20"/>
+        </w:rPr>
+        <w:t xml:space="preserve"> (solicitudes </w:t>
+      </w:r>
+      <w:r>
+        <w:rPr>
+          <w:rFonts w:ascii="Calibri" w:hAnsi="Calibri" w:eastAsia="Calibri" w:cs="Calibri"/>
+          <w:b w:val="0"/>
+          <w:bCs w:val="0"/>
+          <w:i w:val="0"/>
+          <w:iCs w:val="0"/>
+          <w:color w:val="000000"/>
+          <w:sz w:val="22"/>
+          <w:szCs w:val="20"/>
+        </w:rPr>
+        <w:t xml:space="preserve">broadcast</w:t>
+      </w:r>
+      <w:r>
+        <w:rPr>
+          <w:rFonts w:ascii="Calibri" w:hAnsi="Calibri" w:eastAsia="Calibri" w:cs="Calibri"/>
+          <w:b w:val="0"/>
+          <w:bCs w:val="0"/>
+          <w:i w:val="0"/>
+          <w:iCs w:val="0"/>
+          <w:color w:val="000000"/>
+          <w:sz w:val="22"/>
+          <w:szCs w:val="20"/>
+        </w:rPr>
+        <w:t xml:space="preserve"> buscando la dirección</w:t>
+      </w:r>
+      <w:r>
+        <w:rPr>
+          <w:rFonts w:ascii="Calibri" w:hAnsi="Calibri" w:eastAsia="Calibri" w:cs="Calibri"/>
+          <w:b w:val="0"/>
+          <w:bCs w:val="0"/>
+          <w:i w:val="0"/>
+          <w:iCs w:val="0"/>
+          <w:color w:val="000000"/>
+          <w:sz w:val="22"/>
+          <w:szCs w:val="20"/>
+          <w:lang w:val="en-US"/>
+        </w:rPr>
+        <w:t xml:space="preserve"> </w:t>
+      </w:r>
+      <w:r>
+        <w:rPr>
+          <w:rFonts w:ascii="Calibri" w:hAnsi="Calibri" w:eastAsia="Calibri" w:cs="Calibri"/>
+          <w:b w:val="0"/>
+          <w:bCs w:val="0"/>
+          <w:i w:val="0"/>
+          <w:iCs w:val="0"/>
+          <w:color w:val="000000"/>
+          <w:sz w:val="22"/>
+          <w:szCs w:val="20"/>
+        </w:rPr>
+        <w:t xml:space="preserve">destino) y el protocolo </w:t>
+      </w:r>
+      <w:r>
+        <w:rPr>
+          <w:rFonts w:ascii="Calibri" w:hAnsi="Calibri" w:eastAsia="Calibri" w:cs="Calibri"/>
+          <w:b w:val="0"/>
+          <w:bCs w:val="0"/>
+          <w:i w:val="0"/>
+          <w:iCs w:val="0"/>
+          <w:color w:val="000000"/>
+          <w:sz w:val="22"/>
+          <w:szCs w:val="20"/>
+        </w:rPr>
+        <w:t xml:space="preserve">ICMP</w:t>
+      </w:r>
+      <w:r>
+        <w:rPr>
+          <w:rFonts w:ascii="Calibri" w:hAnsi="Calibri" w:eastAsia="Calibri" w:cs="Calibri"/>
+          <w:b w:val="0"/>
+          <w:bCs w:val="0"/>
+          <w:i w:val="0"/>
+          <w:iCs w:val="0"/>
+          <w:color w:val="000000"/>
+          <w:sz w:val="22"/>
+          <w:szCs w:val="20"/>
+        </w:rPr>
+        <w:t xml:space="preserve"> (generado </w:t>
+      </w:r>
+      <w:r>
+        <w:rPr>
+          <w:rFonts w:ascii="Calibri" w:hAnsi="Calibri" w:eastAsia="Calibri" w:cs="Calibri"/>
+          <w:b w:val="0"/>
+          <w:bCs w:val="0"/>
+          <w:i w:val="0"/>
+          <w:iCs w:val="0"/>
+          <w:color w:val="000000"/>
+          <w:sz w:val="22"/>
+          <w:szCs w:val="20"/>
+          <w:lang w:val="en-US"/>
+        </w:rPr>
+        <w:t xml:space="preserve">por</w:t>
+      </w:r>
+      <w:r>
+        <w:rPr>
+          <w:rFonts w:ascii="Calibri" w:hAnsi="Calibri" w:eastAsia="Calibri" w:cs="Calibri"/>
+          <w:b w:val="0"/>
+          <w:bCs w:val="0"/>
+          <w:i w:val="0"/>
+          <w:iCs w:val="0"/>
+          <w:color w:val="000000"/>
+          <w:sz w:val="22"/>
+          <w:szCs w:val="20"/>
+        </w:rPr>
+        <w:t xml:space="preserve"> PC4 para </w:t>
+      </w:r>
+      <w:r>
+        <w:rPr>
+          <w:rFonts w:ascii="Calibri" w:hAnsi="Calibri" w:eastAsia="Calibri" w:cs="Calibri"/>
+          <w:b w:val="0"/>
+          <w:bCs w:val="0"/>
+          <w:i w:val="0"/>
+          <w:iCs w:val="0"/>
+          <w:color w:val="000000"/>
+          <w:sz w:val="22"/>
+          <w:szCs w:val="20"/>
+          <w:lang w:val="en-US"/>
+        </w:rPr>
+        <w:t xml:space="preserve">informar</w:t>
+      </w:r>
+      <w:r>
+        <w:rPr>
+          <w:rFonts w:ascii="Calibri" w:hAnsi="Calibri" w:eastAsia="Calibri" w:cs="Calibri"/>
+          <w:b w:val="0"/>
+          <w:bCs w:val="0"/>
+          <w:i w:val="0"/>
+          <w:iCs w:val="0"/>
+          <w:color w:val="000000"/>
+          <w:sz w:val="22"/>
+          <w:szCs w:val="20"/>
+          <w:lang w:val="en-US"/>
+        </w:rPr>
+        <w:t xml:space="preserve"> </w:t>
+      </w:r>
+      <w:r>
+        <w:rPr>
+          <w:rFonts w:ascii="Calibri" w:hAnsi="Calibri" w:eastAsia="Calibri" w:cs="Calibri"/>
+          <w:b w:val="0"/>
+          <w:bCs w:val="0"/>
+          <w:i w:val="0"/>
+          <w:iCs w:val="0"/>
+          <w:color w:val="000000"/>
+          <w:sz w:val="22"/>
+          <w:szCs w:val="20"/>
+        </w:rPr>
+        <w:t xml:space="preserve">el error </w:t>
+      </w:r>
+      <w:r>
+        <w:rPr>
+          <w:rFonts w:ascii="Calibri" w:hAnsi="Calibri" w:eastAsia="Calibri" w:cs="Calibri"/>
+          <w:b w:val="0"/>
+          <w:bCs w:val="0"/>
+          <w:i w:val="0"/>
+          <w:iCs w:val="0"/>
+          <w:color w:val="000000"/>
+          <w:sz w:val="22"/>
+          <w:szCs w:val="20"/>
+          <w:lang w:val="en-US"/>
+        </w:rPr>
+        <w:t xml:space="preserve">al no encontrar el equipo con dicha IP</w:t>
+      </w:r>
+      <w:r>
+        <w:rPr>
+          <w:rFonts w:ascii="Calibri" w:hAnsi="Calibri" w:eastAsia="Calibri" w:cs="Calibri"/>
+          <w:b w:val="0"/>
+          <w:bCs w:val="0"/>
+          <w:i w:val="0"/>
+          <w:iCs w:val="0"/>
+          <w:color w:val="000000"/>
+          <w:sz w:val="22"/>
+          <w:szCs w:val="20"/>
+        </w:rPr>
+        <w:t xml:space="preserve">)</w:t>
+      </w:r>
+      <w:r>
+        <w:rPr>
+          <w:rFonts w:ascii="Calibri" w:hAnsi="Calibri" w:cs="Calibri"/>
+          <w:b w:val="0"/>
+          <w:bCs w:val="0"/>
+          <w:i w:val="0"/>
+          <w:iCs w:val="0"/>
+          <w:sz w:val="22"/>
+          <w:szCs w:val="20"/>
+        </w:rPr>
+      </w:r>
+    </w:p>
+    <w:p>
+      <w:pPr>
+        <w:spacing/>
+        <w:ind w:right="0" w:firstLine="0" w:left="0"/>
+        <w:jc w:val="left"/>
+        <w:rPr>
+          <w:rFonts w:ascii="Calibri" w:hAnsi="Calibri" w:cs="Calibri"/>
+          <w:b w:val="0"/>
+          <w:bCs w:val="0"/>
+          <w:i w:val="0"/>
+          <w:sz w:val="22"/>
+          <w:szCs w:val="22"/>
+        </w:rPr>
+      </w:pPr>
+      <w:r>
+        <w:rPr>
+          <w:rFonts w:ascii="Calibri" w:hAnsi="Calibri" w:eastAsia="Calibri" w:cs="Calibri"/>
+          <w:b w:val="0"/>
+          <w:bCs w:val="0"/>
+          <w:i w:val="0"/>
+          <w:iCs w:val="0"/>
+          <w:color w:val="000000"/>
+          <w:sz w:val="22"/>
+          <w:szCs w:val="20"/>
+        </w:rPr>
+      </w:r>
+      <w:r>
+        <w:rPr>
+          <w:rFonts w:ascii="Calibri" w:hAnsi="Calibri" w:eastAsia="Calibri" w:cs="Calibri"/>
+          <w:b w:val="0"/>
+          <w:bCs w:val="0"/>
+          <w:i w:val="0"/>
+          <w:iCs w:val="0"/>
+          <w:color w:val="000000"/>
+          <w:sz w:val="22"/>
+          <w:szCs w:val="20"/>
+        </w:rPr>
+        <w:t xml:space="preserve">Segunda captura (</w:t>
+      </w:r>
+      <w:r>
+        <w:rPr>
+          <w:rFonts w:ascii="Calibri" w:hAnsi="Calibri" w:eastAsia="Calibri" w:cs="Calibri"/>
+          <w:b w:val="0"/>
+          <w:bCs w:val="0"/>
+          <w:i w:val="0"/>
+          <w:iCs w:val="0"/>
+          <w:color w:val="000000"/>
+          <w:sz w:val="22"/>
+          <w:szCs w:val="20"/>
+          <w:lang w:val="en-US"/>
+        </w:rPr>
+        <w:t xml:space="preserve">captura2.pcap</w:t>
+      </w:r>
+      <w:r>
+        <w:rPr>
+          <w:rFonts w:ascii="Calibri" w:hAnsi="Calibri" w:eastAsia="Calibri" w:cs="Calibri"/>
+          <w:b w:val="0"/>
+          <w:bCs w:val="0"/>
+          <w:i w:val="0"/>
+          <w:iCs w:val="0"/>
+          <w:color w:val="000000"/>
+          <w:sz w:val="22"/>
+          <w:szCs w:val="20"/>
+        </w:rPr>
+        <w:t xml:space="preserve">):</w:t>
+      </w:r>
+      <w:r>
+        <w:rPr>
+          <w:rFonts w:ascii="Calibri" w:hAnsi="Calibri" w:eastAsia="Calibri" w:cs="Calibri"/>
+          <w:b w:val="0"/>
+          <w:bCs w:val="0"/>
+          <w:i w:val="0"/>
+          <w:iCs w:val="0"/>
+          <w:color w:val="000000"/>
+          <w:sz w:val="22"/>
+          <w:szCs w:val="20"/>
+        </w:rPr>
+        <w:t xml:space="preserve"> Intervienen el protocolo </w:t>
+      </w:r>
+      <w:r>
+        <w:rPr>
+          <w:rFonts w:ascii="Calibri" w:hAnsi="Calibri" w:eastAsia="Calibri" w:cs="Calibri"/>
+          <w:b w:val="0"/>
+          <w:bCs w:val="0"/>
+          <w:i w:val="0"/>
+          <w:iCs w:val="0"/>
+          <w:color w:val="000000"/>
+          <w:sz w:val="22"/>
+          <w:szCs w:val="20"/>
+        </w:rPr>
+        <w:t xml:space="preserve">ARP</w:t>
+      </w:r>
+      <w:r>
+        <w:rPr>
+          <w:rFonts w:ascii="Calibri" w:hAnsi="Calibri" w:eastAsia="Calibri" w:cs="Calibri"/>
+          <w:b w:val="0"/>
+          <w:bCs w:val="0"/>
+          <w:i w:val="0"/>
+          <w:iCs w:val="0"/>
+          <w:color w:val="000000"/>
+          <w:sz w:val="22"/>
+          <w:szCs w:val="20"/>
+        </w:rPr>
+        <w:t xml:space="preserve"> (</w:t>
+      </w:r>
+      <w:r>
+        <w:rPr>
+          <w:rFonts w:ascii="Calibri" w:hAnsi="Calibri" w:eastAsia="Calibri" w:cs="Calibri"/>
+          <w:b w:val="0"/>
+          <w:bCs w:val="0"/>
+          <w:i w:val="0"/>
+          <w:iCs w:val="0"/>
+          <w:color w:val="000000"/>
+          <w:sz w:val="22"/>
+          <w:szCs w:val="20"/>
+          <w:lang w:val="en-US"/>
+        </w:rPr>
+        <w:t xml:space="preserve">usado por PC4 para encontrar el router hacia el Datacenter</w:t>
+      </w:r>
+      <w:r>
+        <w:rPr>
+          <w:rFonts w:ascii="Calibri" w:hAnsi="Calibri" w:eastAsia="Calibri" w:cs="Calibri"/>
+          <w:b w:val="0"/>
+          <w:bCs w:val="0"/>
+          <w:i w:val="0"/>
+          <w:iCs w:val="0"/>
+          <w:color w:val="000000"/>
+          <w:sz w:val="22"/>
+          <w:szCs w:val="20"/>
+        </w:rPr>
+        <w:t xml:space="preserve">) y el protocolo </w:t>
+      </w:r>
+      <w:r>
+        <w:rPr>
+          <w:rFonts w:ascii="Calibri" w:hAnsi="Calibri" w:eastAsia="Calibri" w:cs="Calibri"/>
+          <w:b w:val="0"/>
+          <w:bCs w:val="0"/>
+          <w:i w:val="0"/>
+          <w:iCs w:val="0"/>
+          <w:color w:val="000000"/>
+          <w:sz w:val="22"/>
+          <w:szCs w:val="20"/>
+        </w:rPr>
+        <w:t xml:space="preserve">ICMP</w:t>
+      </w:r>
+      <w:r>
+        <w:rPr>
+          <w:rFonts w:ascii="Calibri" w:hAnsi="Calibri" w:eastAsia="Calibri" w:cs="Calibri"/>
+          <w:b w:val="0"/>
+          <w:bCs w:val="0"/>
+          <w:i w:val="0"/>
+          <w:iCs w:val="0"/>
+          <w:color w:val="000000"/>
+          <w:sz w:val="22"/>
+          <w:szCs w:val="20"/>
+        </w:rPr>
+        <w:t xml:space="preserve"> (para el envío del paquete </w:t>
+      </w:r>
+      <w:r>
+        <w:rPr>
+          <w:rFonts w:ascii="Calibri" w:hAnsi="Calibri" w:eastAsia="Calibri" w:cs="Calibri"/>
+          <w:b w:val="0"/>
+          <w:bCs w:val="0"/>
+          <w:i w:val="0"/>
+          <w:iCs w:val="0"/>
+          <w:color w:val="000000"/>
+          <w:sz w:val="22"/>
+          <w:szCs w:val="20"/>
+        </w:rPr>
+      </w:r>
+      <w:r>
+        <w:rPr>
+          <w:rFonts w:ascii="Calibri" w:hAnsi="Calibri" w:eastAsia="Calibri" w:cs="Calibri"/>
+          <w:b w:val="0"/>
+          <w:bCs w:val="0"/>
+          <w:i w:val="0"/>
+          <w:iCs w:val="0"/>
+          <w:color w:val="000000"/>
+          <w:sz w:val="22"/>
+          <w:szCs w:val="20"/>
+        </w:rPr>
+        <w:t xml:space="preserve">hacia el Datacenter y para el error </w:t>
+      </w:r>
+      <w:r>
+        <w:rPr>
+          <w:rFonts w:ascii="Calibri" w:hAnsi="Calibri" w:eastAsia="Calibri" w:cs="Calibri"/>
+          <w:b w:val="0"/>
+          <w:bCs w:val="0"/>
+          <w:i w:val="0"/>
+          <w:iCs w:val="0"/>
+          <w:color w:val="000000"/>
+          <w:sz w:val="22"/>
+          <w:szCs w:val="20"/>
+        </w:rPr>
+        <w:t xml:space="preserve">Destination unreachable</w:t>
+      </w:r>
+      <w:r>
+        <w:rPr>
+          <w:rFonts w:ascii="Calibri" w:hAnsi="Calibri" w:eastAsia="Calibri" w:cs="Calibri"/>
+          <w:b w:val="0"/>
+          <w:bCs w:val="0"/>
+          <w:i w:val="0"/>
+          <w:iCs w:val="0"/>
+          <w:color w:val="000000"/>
+          <w:sz w:val="22"/>
+          <w:szCs w:val="20"/>
+        </w:rPr>
+        <w:t xml:space="preserve"> devuelto por el router)</w:t>
+      </w:r>
+      <w:r>
+        <w:rPr>
+          <w:rFonts w:ascii="Calibri" w:hAnsi="Calibri" w:cs="Calibri"/>
+          <w:b w:val="0"/>
+          <w:bCs w:val="0"/>
+          <w:i w:val="0"/>
+          <w:iCs w:val="0"/>
+          <w:sz w:val="22"/>
+          <w:szCs w:val="20"/>
+        </w:rPr>
+      </w:r>
+      <w:r>
+        <w:rPr>
+          <w:i w:val="0"/>
+          <w:iCs w:val="0"/>
+        </w:rPr>
+      </w:r>
+    </w:p>
+    <w:p>
+      <w:pPr>
+        <w:pStyle w:val="920"/>
+        <w:spacing w:after="0" w:before="0" w:line="240" w:lineRule="auto"/>
+        <w:ind/>
+        <w:jc w:val="both"/>
+        <w:rPr/>
+      </w:pPr>
+      <w:r/>
+      <w:r/>
+      <w:r/>
+    </w:p>
+    <w:p>
+      <w:pPr>
+        <w:pStyle w:val="920"/>
+        <w:spacing w:after="0" w:before="0" w:line="240" w:lineRule="auto"/>
+        <w:ind/>
+        <w:jc w:val="both"/>
+        <w:rPr>
+          <w:highlight w:val="none"/>
+          <w:lang w:val="en-US"/>
+        </w:rPr>
+      </w:pPr>
+      <w:r>
+        <w:rPr>
+          <w:highlight w:val="none"/>
+        </w:rPr>
+      </w:r>
+      <w:r>
+        <w:rPr>
+          <w:highlight w:val="none"/>
+          <w:lang w:val="en-US"/>
+        </w:rPr>
+        <w:t xml:space="preserve">En la primera captura de wireshark (captura.pcap) se observa que PC4 intent</w:t>
+      </w:r>
+      <w:r>
+        <w:rPr>
+          <w:highlight w:val="none"/>
+          <w:lang w:val="en-US"/>
+        </w:rPr>
+        <w:t xml:space="preserve">ó 3 veces mandar un mensaje a broadcast para saber que equipo ten</w:t>
+      </w:r>
+      <w:r>
+        <w:rPr>
+          <w:highlight w:val="none"/>
+          <w:lang w:val="en-US"/>
+        </w:rPr>
+        <w:t xml:space="preserve">ía la IP </w:t>
+      </w:r>
+      <w:r>
+        <w:t xml:space="preserve">10.2.5.200</w:t>
+      </w:r>
+      <w:r>
+        <w:rPr>
+          <w:highlight w:val="none"/>
+          <w:lang w:val="en-US"/>
+        </w:rPr>
+        <w:t xml:space="preserve">, al no tener respuesta prepar</w:t>
+      </w:r>
+      <w:r>
+        <w:rPr>
+          <w:highlight w:val="none"/>
+          <w:lang w:val="en-US"/>
+        </w:rPr>
+        <w:t xml:space="preserve">ó un mensaje de error. Mientras que en la segunda captura (captura2.pcap) la PC4 le pasa el mensaje al R5, y al no encontrar la IP indicada en el Datacenter, devuelve un mensaje de error</w:t>
+      </w:r>
+      <w:r>
+        <w:rPr>
+          <w:highlight w:val="none"/>
+          <w:lang w:val="en-US"/>
+        </w:rPr>
+      </w:r>
+      <w:r>
+        <w:rPr>
+          <w:highlight w:val="none"/>
+          <w:lang w:val="en-US"/>
+        </w:rPr>
+      </w:r>
     </w:p>
     <w:sectPr>
       <w:headerReference w:type="default" r:id="rId9"/>
@@ -3269,7 +4903,7 @@
       <w:endnotePr/>
       <w:type w:val="nextPage"/>
       <w:pgSz w:h="16838" w:orient="portrait" w:w="11906"/>
-      <w:pgMar w:top="1417" w:right="1701" w:bottom="256" w:left="1701" w:header="708" w:footer="0" w:gutter="0"/>
+      <w:pgMar w:top="1417" w:right="1701" w:bottom="397" w:left="1701" w:header="708" w:footer="0" w:gutter="0"/>
       <w:pgNumType w:start="1"/>
       <w:cols w:num="1" w:sep="0" w:space="1701" w:equalWidth="1"/>
     </w:sectPr>
@@ -4373,6 +6007,153 @@
       <w:suff w:val="nothing"/>
     </w:lvl>
   </w:abstractNum>
+  <w:abstractNum w:abstractNumId="6">
+    <w:nsid w:val="23F64697"/>
+    <w:lvl w:ilvl="0">
+      <w:isLgl w:val="false"/>
+      <w:lvlJc w:val="left"/>
+      <w:lvlText w:val="·"/>
+      <w:numFmt w:val="bullet"/>
+      <w:pPr>
+        <w:pBdr/>
+        <w:spacing/>
+        <w:ind w:hanging="360" w:left="709"/>
+      </w:pPr>
+      <w:rPr>
+        <w:rFonts w:hint="default" w:ascii="Symbol" w:hAnsi="Symbol" w:eastAsia="Symbol" w:cs="Symbol"/>
+      </w:rPr>
+      <w:start w:val="1"/>
+      <w:suff w:val="tab"/>
+    </w:lvl>
+    <w:lvl w:ilvl="1">
+      <w:isLgl w:val="false"/>
+      <w:lvlJc w:val="left"/>
+      <w:lvlText w:val="o"/>
+      <w:numFmt w:val="bullet"/>
+      <w:pPr>
+        <w:pBdr/>
+        <w:spacing/>
+        <w:ind w:hanging="360" w:left="1429"/>
+      </w:pPr>
+      <w:rPr>
+        <w:rFonts w:hint="default" w:ascii="Courier New" w:hAnsi="Courier New" w:eastAsia="Courier New" w:cs="Courier New"/>
+      </w:rPr>
+      <w:start w:val="1"/>
+      <w:suff w:val="tab"/>
+    </w:lvl>
+    <w:lvl w:ilvl="2">
+      <w:isLgl w:val="false"/>
+      <w:lvlJc w:val="left"/>
+      <w:lvlText w:val="§"/>
+      <w:numFmt w:val="bullet"/>
+      <w:pPr>
+        <w:pBdr/>
+        <w:spacing/>
+        <w:ind w:hanging="360" w:left="2149"/>
+      </w:pPr>
+      <w:rPr>
+        <w:rFonts w:hint="default" w:ascii="Wingdings" w:hAnsi="Wingdings" w:eastAsia="Wingdings" w:cs="Wingdings"/>
+      </w:rPr>
+      <w:start w:val="1"/>
+      <w:suff w:val="tab"/>
+    </w:lvl>
+    <w:lvl w:ilvl="3">
+      <w:isLgl w:val="false"/>
+      <w:lvlJc w:val="left"/>
+      <w:lvlText w:val="·"/>
+      <w:numFmt w:val="bullet"/>
+      <w:pPr>
+        <w:pBdr/>
+        <w:spacing/>
+        <w:ind w:hanging="360" w:left="2869"/>
+      </w:pPr>
+      <w:rPr>
+        <w:rFonts w:hint="default" w:ascii="Symbol" w:hAnsi="Symbol" w:eastAsia="Symbol" w:cs="Symbol"/>
+      </w:rPr>
+      <w:start w:val="1"/>
+      <w:suff w:val="tab"/>
+    </w:lvl>
+    <w:lvl w:ilvl="4">
+      <w:isLgl w:val="false"/>
+      <w:lvlJc w:val="left"/>
+      <w:lvlText w:val="o"/>
+      <w:numFmt w:val="bullet"/>
+      <w:pPr>
+        <w:pBdr/>
+        <w:spacing/>
+        <w:ind w:hanging="360" w:left="3589"/>
+      </w:pPr>
+      <w:rPr>
+        <w:rFonts w:hint="default" w:ascii="Courier New" w:hAnsi="Courier New" w:eastAsia="Courier New" w:cs="Courier New"/>
+      </w:rPr>
+      <w:start w:val="1"/>
+      <w:suff w:val="tab"/>
+    </w:lvl>
+    <w:lvl w:ilvl="5">
+      <w:isLgl w:val="false"/>
+      <w:lvlJc w:val="left"/>
+      <w:lvlText w:val="§"/>
+      <w:numFmt w:val="bullet"/>
+      <w:pPr>
+        <w:pBdr/>
+        <w:spacing/>
+        <w:ind w:hanging="360" w:left="4309"/>
+      </w:pPr>
+      <w:rPr>
+        <w:rFonts w:hint="default" w:ascii="Wingdings" w:hAnsi="Wingdings" w:eastAsia="Wingdings" w:cs="Wingdings"/>
+      </w:rPr>
+      <w:start w:val="1"/>
+      <w:suff w:val="tab"/>
+    </w:lvl>
+    <w:lvl w:ilvl="6">
+      <w:isLgl w:val="false"/>
+      <w:lvlJc w:val="left"/>
+      <w:lvlText w:val="·"/>
+      <w:numFmt w:val="bullet"/>
+      <w:pPr>
+        <w:pBdr/>
+        <w:spacing/>
+        <w:ind w:hanging="360" w:left="5029"/>
+      </w:pPr>
+      <w:rPr>
+        <w:rFonts w:hint="default" w:ascii="Symbol" w:hAnsi="Symbol" w:eastAsia="Symbol" w:cs="Symbol"/>
+      </w:rPr>
+      <w:start w:val="1"/>
+      <w:suff w:val="tab"/>
+    </w:lvl>
+    <w:lvl w:ilvl="7">
+      <w:isLgl w:val="false"/>
+      <w:lvlJc w:val="left"/>
+      <w:lvlText w:val="o"/>
+      <w:numFmt w:val="bullet"/>
+      <w:pPr>
+        <w:pBdr/>
+        <w:spacing/>
+        <w:ind w:hanging="360" w:left="5749"/>
+      </w:pPr>
+      <w:rPr>
+        <w:rFonts w:hint="default" w:ascii="Courier New" w:hAnsi="Courier New" w:eastAsia="Courier New" w:cs="Courier New"/>
+      </w:rPr>
+      <w:start w:val="1"/>
+      <w:suff w:val="tab"/>
+    </w:lvl>
+    <w:lvl w:ilvl="8">
+      <w:isLgl w:val="false"/>
+      <w:lvlJc w:val="left"/>
+      <w:lvlText w:val="§"/>
+      <w:numFmt w:val="bullet"/>
+      <w:pPr>
+        <w:pBdr/>
+        <w:spacing/>
+        <w:ind w:hanging="360" w:left="6469"/>
+      </w:pPr>
+      <w:rPr>
+        <w:rFonts w:hint="default" w:ascii="Wingdings" w:hAnsi="Wingdings" w:eastAsia="Wingdings" w:cs="Wingdings"/>
+      </w:rPr>
+      <w:start w:val="1"/>
+      <w:suff w:val="tab"/>
+    </w:lvl>
+  </w:abstractNum>
   <w:num w:numId="1">
     <w:abstractNumId w:val="0"/>
   </w:num>
@@ -4390,6 +6171,9 @@
   </w:num>
   <w:num w:numId="6">
     <w:abstractNumId w:val="5"/>
+  </w:num>
+  <w:num w:numId="7">
+    <w:abstractNumId w:val="6"/>
   </w:num>
 </w:numbering>
 </file>

</xml_diff>